<commit_message>
huge update, see files details
</commit_message>
<xml_diff>
--- a/docs/Protocol_EVO_SSL_670_5.docx
+++ b/docs/Protocol_EVO_SSL_670_5.docx
@@ -2782,7 +2782,19 @@
       </w:r>
       <w:proofErr w:type="spellEnd"/>
       <w:r>
-        <w:t>&gt; &lt;</w:t>
+        <w:t>&gt;</w:t>
+      </w:r>
+      <w:r>
+        <w:t xml:space="preserve"> </w:t>
+      </w:r>
+      <w:r>
+        <w:rPr>
+          <w:highlight w:val="yellow"/>
+        </w:rPr>
+        <w:t>&lt;overheat&gt;</w:t>
+      </w:r>
+      <w:r>
+        <w:t xml:space="preserve"> &lt;</w:t>
       </w:r>
       <w:proofErr w:type="spellStart"/>
       <w:r>
@@ -2975,6 +2987,49 @@
       </w:r>
       <w:r>
         <w:t xml:space="preserve">- chiller fail (int), 0 – ok, 1 – alarm </w:t>
+      </w:r>
+    </w:p>
+    <w:p>
+      <w:pPr>
+        <w:pStyle w:val="a0"/>
+        <w:numPr>
+          <w:ilvl w:val="0"/>
+          <w:numId w:val="14"/>
+        </w:numPr>
+        <w:rPr>
+          <w:rFonts w:cs="Arial"/>
+          <w:highlight w:val="yellow"/>
+        </w:rPr>
+      </w:pPr>
+      <w:r>
+        <w:rPr>
+          <w:highlight w:val="yellow"/>
+        </w:rPr>
+        <w:t>&lt;</w:t>
+      </w:r>
+      <w:r>
+        <w:rPr>
+          <w:highlight w:val="yellow"/>
+        </w:rPr>
+        <w:t>overheat</w:t>
+      </w:r>
+      <w:r>
+        <w:rPr>
+          <w:highlight w:val="yellow"/>
+        </w:rPr>
+        <w:t xml:space="preserve">&gt; - </w:t>
+      </w:r>
+      <w:r>
+        <w:rPr>
+          <w:highlight w:val="yellow"/>
+        </w:rPr>
+        <w:t>overheat state</w:t>
+      </w:r>
+      <w:r>
+        <w:rPr>
+          <w:highlight w:val="yellow"/>
+        </w:rPr>
+        <w:t xml:space="preserve"> (int), 0 – ok, 1 – alarm </w:t>
       </w:r>
     </w:p>
     <w:p>
@@ -3442,10 +3497,7 @@
         <w:t>l</w:t>
       </w:r>
       <w:r>
-        <w:t>r</w:t>
-      </w:r>
-      <w:r>
-        <w:t>psupermission</w:t>
+        <w:t>rpsupermission</w:t>
       </w:r>
       <w:proofErr w:type="spellEnd"/>
       <w:proofErr w:type="gramEnd"/>
@@ -3479,10 +3531,7 @@
         <w:t>l</w:t>
       </w:r>
       <w:r>
-        <w:t>r</w:t>
-      </w:r>
-      <w:r>
-        <w:t>psupermission</w:t>
+        <w:t>rpsupermission</w:t>
       </w:r>
       <w:proofErr w:type="spellEnd"/>
       <w:proofErr w:type="gramEnd"/>
@@ -3603,10 +3652,7 @@
         <w:t>l</w:t>
       </w:r>
       <w:r>
-        <w:t>r</w:t>
-      </w:r>
-      <w:r>
-        <w:t>errclr</w:t>
+        <w:t>rerrclr</w:t>
       </w:r>
       <w:proofErr w:type="spellEnd"/>
       <w:proofErr w:type="gramEnd"/>
@@ -3640,10 +3686,7 @@
         <w:t>l</w:t>
       </w:r>
       <w:r>
-        <w:t>r</w:t>
-      </w:r>
-      <w:r>
-        <w:t>errclr</w:t>
+        <w:t>rerrclr</w:t>
       </w:r>
       <w:proofErr w:type="spellEnd"/>
       <w:proofErr w:type="gramEnd"/>
@@ -3687,204 +3730,119 @@
     <w:p>
       <w:pPr>
         <w:pStyle w:val="20"/>
-        <w:rPr>
-          <w:highlight w:val="black"/>
-        </w:rPr>
       </w:pPr>
       <w:bookmarkStart w:id="12" w:name="_Toc226291976"/>
       <w:r>
-        <w:rPr>
-          <w:highlight w:val="black"/>
-        </w:rPr>
-        <w:t>Request to set seed pulse’s frequency</w:t>
+        <w:t xml:space="preserve">Request to set </w:t>
+      </w:r>
+      <w:proofErr w:type="spellStart"/>
+      <w:r>
+        <w:t>quantron</w:t>
+      </w:r>
+      <w:proofErr w:type="spellEnd"/>
+      <w:r>
+        <w:t xml:space="preserve"> </w:t>
+      </w:r>
+      <w:r>
+        <w:t>pulse frequency</w:t>
       </w:r>
       <w:bookmarkEnd w:id="12"/>
       <w:r>
-        <w:rPr>
-          <w:highlight w:val="black"/>
-        </w:rPr>
         <w:t xml:space="preserve"> </w:t>
       </w:r>
     </w:p>
     <w:p>
       <w:pPr>
         <w:pStyle w:val="Requeststyle"/>
-        <w:rPr>
-          <w:highlight w:val="black"/>
-        </w:rPr>
-      </w:pPr>
-      <w:r>
-        <w:rPr>
-          <w:highlight w:val="black"/>
-        </w:rPr>
+      </w:pPr>
+      <w:r>
         <w:t>"</w:t>
       </w:r>
       <w:proofErr w:type="spellStart"/>
       <w:r>
-        <w:rPr>
-          <w:highlight w:val="black"/>
-        </w:rPr>
         <w:t>lsfreq</w:t>
       </w:r>
       <w:proofErr w:type="spellEnd"/>
       <w:r>
-        <w:rPr>
-          <w:highlight w:val="black"/>
-        </w:rPr>
         <w:t xml:space="preserve"> </w:t>
       </w:r>
       <w:proofErr w:type="spellStart"/>
       <w:r>
-        <w:rPr>
-          <w:highlight w:val="black"/>
-        </w:rPr>
         <w:t>usr</w:t>
       </w:r>
       <w:proofErr w:type="spellEnd"/>
       <w:r>
-        <w:rPr>
-          <w:highlight w:val="black"/>
-        </w:rPr>
         <w:t xml:space="preserve"> &lt;id&gt; &lt;value&gt;\r"</w:t>
       </w:r>
     </w:p>
     <w:p>
-      <w:pPr>
-        <w:rPr>
-          <w:highlight w:val="black"/>
-        </w:rPr>
-      </w:pPr>
-      <w:r>
-        <w:rPr>
-          <w:highlight w:val="black"/>
-        </w:rPr>
+      <w:r>
         <w:t>Response:</w:t>
       </w:r>
       <w:r>
-        <w:rPr>
-          <w:highlight w:val="black"/>
-        </w:rPr>
         <w:tab/>
       </w:r>
     </w:p>
     <w:p>
       <w:pPr>
         <w:pStyle w:val="Responsestyle"/>
-        <w:rPr>
-          <w:highlight w:val="black"/>
-        </w:rPr>
-      </w:pPr>
-      <w:r>
-        <w:rPr>
-          <w:highlight w:val="black"/>
-        </w:rPr>
+      </w:pPr>
+      <w:r>
         <w:t>“</w:t>
       </w:r>
       <w:proofErr w:type="spellStart"/>
       <w:proofErr w:type="gramStart"/>
       <w:r>
-        <w:rPr>
-          <w:highlight w:val="black"/>
-        </w:rPr>
         <w:t>lrfreq</w:t>
       </w:r>
       <w:proofErr w:type="spellEnd"/>
       <w:proofErr w:type="gramEnd"/>
       <w:r>
-        <w:rPr>
-          <w:highlight w:val="black"/>
-        </w:rPr>
         <w:t xml:space="preserve"> </w:t>
       </w:r>
       <w:proofErr w:type="spellStart"/>
       <w:r>
-        <w:rPr>
-          <w:highlight w:val="black"/>
-        </w:rPr>
         <w:t>usr</w:t>
       </w:r>
       <w:proofErr w:type="spellEnd"/>
       <w:r>
-        <w:rPr>
-          <w:highlight w:val="black"/>
-        </w:rPr>
         <w:t xml:space="preserve"> &lt;id&gt; &lt;value&gt;\r"</w:t>
       </w:r>
     </w:p>
     <w:p>
-      <w:pPr>
-        <w:rPr>
-          <w:highlight w:val="black"/>
-        </w:rPr>
-      </w:pPr>
-      <w:r>
-        <w:rPr>
-          <w:highlight w:val="black"/>
-        </w:rPr>
+      <w:r>
         <w:t>ERROR response:</w:t>
       </w:r>
     </w:p>
     <w:p>
       <w:pPr>
         <w:pStyle w:val="Responsestyle"/>
-        <w:rPr>
-          <w:highlight w:val="black"/>
-        </w:rPr>
-      </w:pPr>
-      <w:r>
-        <w:rPr>
-          <w:highlight w:val="black"/>
-        </w:rPr>
+      </w:pPr>
+      <w:r>
         <w:t>“</w:t>
       </w:r>
       <w:proofErr w:type="spellStart"/>
       <w:proofErr w:type="gramStart"/>
       <w:r>
-        <w:rPr>
-          <w:highlight w:val="black"/>
-        </w:rPr>
         <w:t>lrfreq</w:t>
       </w:r>
       <w:proofErr w:type="spellEnd"/>
       <w:proofErr w:type="gramEnd"/>
       <w:r>
-        <w:rPr>
-          <w:highlight w:val="black"/>
-        </w:rPr>
         <w:t xml:space="preserve"> </w:t>
       </w:r>
       <w:proofErr w:type="spellStart"/>
       <w:r>
-        <w:rPr>
-          <w:highlight w:val="black"/>
-        </w:rPr>
         <w:t>usr</w:t>
       </w:r>
       <w:proofErr w:type="spellEnd"/>
       <w:r>
-        <w:rPr>
-          <w:highlight w:val="black"/>
-        </w:rPr>
         <w:t xml:space="preserve"> &lt;id&gt; ERR\r”</w:t>
       </w:r>
     </w:p>
-    <w:p>
-      <w:pPr>
-        <w:rPr>
-          <w:highlight w:val="black"/>
-        </w:rPr>
-      </w:pPr>
-    </w:p>
-    <w:p>
-      <w:pPr>
-        <w:rPr>
-          <w:highlight w:val="black"/>
-        </w:rPr>
-      </w:pPr>
-      <w:r>
-        <w:rPr>
-          <w:highlight w:val="black"/>
-        </w:rPr>
+    <w:p/>
+    <w:p>
+      <w:r>
         <w:t xml:space="preserve">Where:  </w:t>
       </w:r>
     </w:p>
@@ -3895,14 +3853,8 @@
           <w:ilvl w:val="0"/>
           <w:numId w:val="9"/>
         </w:numPr>
-        <w:rPr>
-          <w:highlight w:val="black"/>
-        </w:rPr>
-      </w:pPr>
-      <w:r>
-        <w:rPr>
-          <w:highlight w:val="black"/>
-        </w:rPr>
+      </w:pPr>
+      <w:r>
         <w:t>&lt;id&gt; - device id, (int); always 0.</w:t>
       </w:r>
     </w:p>
@@ -3915,634 +3867,208 @@
         </w:numPr>
         <w:rPr>
           <w:rFonts w:cs="Arial"/>
+        </w:rPr>
+      </w:pPr>
+      <w:r>
+        <w:rPr>
+          <w:rFonts w:cs="Arial"/>
+        </w:rPr>
+        <w:t>&lt;value&gt; -</w:t>
+      </w:r>
+      <w:r>
+        <w:rPr>
+          <w:rFonts w:cs="Arial"/>
+        </w:rPr>
+        <w:t xml:space="preserve"> </w:t>
+      </w:r>
+      <w:r>
+        <w:rPr>
+          <w:rFonts w:cs="Arial"/>
+        </w:rPr>
+        <w:t>frequency</w:t>
+      </w:r>
+      <w:r>
+        <w:rPr>
+          <w:rFonts w:cs="Arial"/>
+        </w:rPr>
+        <w:t xml:space="preserve"> value</w:t>
+      </w:r>
+      <w:r>
+        <w:rPr>
+          <w:rFonts w:cs="Arial"/>
+        </w:rPr>
+        <w:t xml:space="preserve"> (int)</w:t>
+      </w:r>
+      <w:r>
+        <w:rPr>
+          <w:rFonts w:cs="Arial"/>
+        </w:rPr>
+        <w:t>, 1</w:t>
+      </w:r>
+      <w:r>
+        <w:rPr>
+          <w:rFonts w:cs="Arial"/>
+        </w:rPr>
+        <w:t xml:space="preserve"> – 100 Hz</w:t>
+      </w:r>
+    </w:p>
+    <w:p>
+      <w:pPr>
+        <w:ind w:firstLine="0"/>
+      </w:pPr>
+    </w:p>
+    <w:p/>
+    <w:p/>
+    <w:p>
+      <w:pPr>
+        <w:rPr>
           <w:highlight w:val="black"/>
         </w:rPr>
       </w:pPr>
-      <w:r>
+    </w:p>
+    <w:p>
+      <w:pPr>
+        <w:ind w:firstLine="0"/>
+        <w:rPr>
+          <w:highlight w:val="black"/>
+        </w:rPr>
+      </w:pPr>
+    </w:p>
+    <w:p>
+      <w:pPr>
+        <w:pStyle w:val="20"/>
+      </w:pPr>
+      <w:bookmarkStart w:id="13" w:name="_Toc226291979"/>
+      <w:r>
+        <w:lastRenderedPageBreak/>
+        <w:t xml:space="preserve">Request set </w:t>
+      </w:r>
+      <w:r>
+        <w:rPr>
+          <w:lang w:val="fr-FR"/>
+        </w:rPr>
+        <w:t>pulse dur</w:t>
+      </w:r>
+      <w:proofErr w:type="spellStart"/>
+      <w:r>
+        <w:t>ation</w:t>
+      </w:r>
+      <w:bookmarkEnd w:id="13"/>
+      <w:proofErr w:type="spellEnd"/>
+    </w:p>
+    <w:p>
+      <w:pPr>
+        <w:pStyle w:val="Requeststyle"/>
+      </w:pPr>
+      <w:r>
+        <w:t>"</w:t>
+      </w:r>
+      <w:proofErr w:type="spellStart"/>
+      <w:r>
+        <w:t>lsdura</w:t>
+      </w:r>
+      <w:proofErr w:type="spellEnd"/>
+      <w:r>
+        <w:t xml:space="preserve"> </w:t>
+      </w:r>
+      <w:proofErr w:type="spellStart"/>
+      <w:r>
+        <w:t>usr</w:t>
+      </w:r>
+      <w:proofErr w:type="spellEnd"/>
+      <w:r>
+        <w:t xml:space="preserve"> &lt;id&gt; &lt;value&gt;\r"</w:t>
+      </w:r>
+    </w:p>
+    <w:p>
+      <w:pPr>
+        <w:spacing w:before="120" w:after="40"/>
         <w:rPr>
           <w:rFonts w:cs="Arial"/>
-          <w:highlight w:val="black"/>
-        </w:rPr>
-        <w:t>&lt;value&gt; -</w:t>
-      </w:r>
+        </w:rPr>
+      </w:pPr>
       <w:r>
         <w:rPr>
           <w:rFonts w:cs="Arial"/>
-          <w:highlight w:val="black"/>
-        </w:rPr>
+        </w:rPr>
+        <w:t>Response:</w:t>
+      </w:r>
+    </w:p>
+    <w:p>
+      <w:pPr>
+        <w:pStyle w:val="Responsestyle"/>
+        <w:rPr>
+          <w:rFonts w:ascii="Arial" w:hAnsi="Arial"/>
+        </w:rPr>
+      </w:pPr>
+      <w:r>
+        <w:t>"</w:t>
+      </w:r>
+      <w:proofErr w:type="spellStart"/>
+      <w:r>
+        <w:t>lsdura</w:t>
+      </w:r>
+      <w:proofErr w:type="spellEnd"/>
+      <w:r>
         <w:t xml:space="preserve"> </w:t>
       </w:r>
-      <w:r>
+      <w:proofErr w:type="spellStart"/>
+      <w:r>
+        <w:t>usr</w:t>
+      </w:r>
+      <w:proofErr w:type="spellEnd"/>
+      <w:r>
+        <w:t xml:space="preserve"> &lt;id&gt; &lt;value&gt;\r"</w:t>
+      </w:r>
+    </w:p>
+    <w:p>
+      <w:pPr>
+        <w:spacing w:before="120" w:after="40"/>
         <w:rPr>
           <w:rFonts w:cs="Arial"/>
-          <w:highlight w:val="black"/>
-        </w:rPr>
-        <w:t>frequency</w:t>
-      </w:r>
+        </w:rPr>
+      </w:pPr>
       <w:r>
         <w:rPr>
           <w:rFonts w:cs="Arial"/>
-          <w:highlight w:val="black"/>
-        </w:rPr>
-        <w:t xml:space="preserve"> value</w:t>
-      </w:r>
-      <w:r>
+        </w:rPr>
+        <w:t>ERROR response:</w:t>
+      </w:r>
+    </w:p>
+    <w:p>
+      <w:pPr>
+        <w:pStyle w:val="Responsestyle"/>
+      </w:pPr>
+      <w:r>
+        <w:t>"</w:t>
+      </w:r>
+      <w:proofErr w:type="spellStart"/>
+      <w:r>
+        <w:t>lsdura</w:t>
+      </w:r>
+      <w:proofErr w:type="spellEnd"/>
+      <w:r>
+        <w:t xml:space="preserve"> </w:t>
+      </w:r>
+      <w:proofErr w:type="spellStart"/>
+      <w:r>
+        <w:t>usr</w:t>
+      </w:r>
+      <w:proofErr w:type="spellEnd"/>
+      <w:r>
+        <w:t xml:space="preserve"> &lt;id&gt; ERR\r" </w:t>
+      </w:r>
+    </w:p>
+    <w:p>
+      <w:pPr>
+        <w:spacing w:before="120" w:after="40"/>
         <w:rPr>
           <w:rFonts w:cs="Arial"/>
-          <w:highlight w:val="black"/>
-        </w:rPr>
-        <w:t xml:space="preserve"> (int)</w:t>
-      </w:r>
+        </w:rPr>
+      </w:pPr>
       <w:r>
         <w:rPr>
           <w:rFonts w:cs="Arial"/>
-          <w:highlight w:val="black"/>
-        </w:rPr>
-        <w:t>, range of values: 1000 to 3 000 000</w:t>
-      </w:r>
-    </w:p>
-    <w:p>
-      <w:pPr>
-        <w:ind w:firstLine="0"/>
-        <w:rPr>
-          <w:highlight w:val="black"/>
-        </w:rPr>
-      </w:pPr>
-    </w:p>
-    <w:p>
-      <w:pPr>
-        <w:ind w:firstLine="0"/>
-        <w:rPr>
-          <w:highlight w:val="black"/>
-        </w:rPr>
-      </w:pPr>
-      <w:r>
-        <w:rPr>
-          <w:highlight w:val="black"/>
-        </w:rPr>
-        <w:t>NOTE:</w:t>
-      </w:r>
-    </w:p>
-    <w:p>
-      <w:pPr>
-        <w:pStyle w:val="a0"/>
-        <w:numPr>
-          <w:ilvl w:val="0"/>
-          <w:numId w:val="10"/>
-        </w:numPr>
-        <w:rPr>
-          <w:i/>
-          <w:iCs/>
-          <w:highlight w:val="black"/>
-        </w:rPr>
-      </w:pPr>
-      <w:r>
-        <w:rPr>
-          <w:i/>
-          <w:iCs/>
-          <w:highlight w:val="black"/>
-        </w:rPr>
-        <w:t>1 Hz increment for frequencies in range 1…1000 Hz.</w:t>
-      </w:r>
-    </w:p>
-    <w:p>
-      <w:pPr>
-        <w:pStyle w:val="a0"/>
-        <w:numPr>
-          <w:ilvl w:val="0"/>
-          <w:numId w:val="10"/>
-        </w:numPr>
-        <w:rPr>
-          <w:i/>
-          <w:iCs/>
-          <w:highlight w:val="black"/>
-        </w:rPr>
-      </w:pPr>
-      <w:r>
-        <w:rPr>
-          <w:i/>
-          <w:iCs/>
-          <w:highlight w:val="black"/>
-        </w:rPr>
-        <w:t>1000 Hz increment for frequencies in range 1kHz … 1MHz.</w:t>
-      </w:r>
-    </w:p>
-    <w:p>
-      <w:pPr>
-        <w:pStyle w:val="a0"/>
-        <w:numPr>
-          <w:ilvl w:val="0"/>
-          <w:numId w:val="10"/>
-        </w:numPr>
-        <w:rPr>
-          <w:i/>
-          <w:iCs/>
-          <w:highlight w:val="black"/>
-        </w:rPr>
-      </w:pPr>
-      <w:r>
-        <w:rPr>
-          <w:i/>
-          <w:iCs/>
-          <w:highlight w:val="black"/>
-        </w:rPr>
-        <w:t>100000 Hz increment for frequencies in range 1MHz … 30MHz.</w:t>
-      </w:r>
-    </w:p>
-    <w:p>
-      <w:pPr>
-        <w:rPr>
-          <w:highlight w:val="black"/>
-        </w:rPr>
-      </w:pPr>
-    </w:p>
-    <w:p>
-      <w:pPr>
-        <w:pStyle w:val="20"/>
-        <w:rPr>
-          <w:highlight w:val="black"/>
-        </w:rPr>
-      </w:pPr>
-      <w:bookmarkStart w:id="13" w:name="_Toc226291977"/>
-      <w:r>
-        <w:rPr>
-          <w:highlight w:val="black"/>
-        </w:rPr>
-        <w:lastRenderedPageBreak/>
-        <w:t>Request to set gate mode</w:t>
-      </w:r>
-      <w:bookmarkEnd w:id="13"/>
-      <w:r>
-        <w:rPr>
-          <w:highlight w:val="black"/>
-        </w:rPr>
-        <w:t xml:space="preserve"> </w:t>
-      </w:r>
-    </w:p>
-    <w:p>
-      <w:pPr>
-        <w:pStyle w:val="Requeststyle"/>
-        <w:rPr>
-          <w:highlight w:val="black"/>
-        </w:rPr>
-      </w:pPr>
-      <w:r>
-        <w:rPr>
-          <w:highlight w:val="black"/>
-        </w:rPr>
-        <w:t>"</w:t>
-      </w:r>
-      <w:proofErr w:type="spellStart"/>
-      <w:r>
-        <w:rPr>
-          <w:highlight w:val="black"/>
-        </w:rPr>
-        <w:t>lsgate</w:t>
-      </w:r>
-      <w:proofErr w:type="spellEnd"/>
-      <w:r>
-        <w:rPr>
-          <w:highlight w:val="black"/>
-        </w:rPr>
-        <w:t xml:space="preserve"> </w:t>
-      </w:r>
-      <w:proofErr w:type="spellStart"/>
-      <w:r>
-        <w:rPr>
-          <w:highlight w:val="black"/>
-        </w:rPr>
-        <w:t>usr</w:t>
-      </w:r>
-      <w:proofErr w:type="spellEnd"/>
-      <w:r>
-        <w:rPr>
-          <w:highlight w:val="black"/>
-        </w:rPr>
-        <w:t xml:space="preserve"> &lt;id&gt; &lt;value&gt;\r"</w:t>
-      </w:r>
-    </w:p>
-    <w:p>
-      <w:pPr>
-        <w:rPr>
-          <w:highlight w:val="black"/>
-        </w:rPr>
-      </w:pPr>
-      <w:r>
-        <w:rPr>
-          <w:highlight w:val="black"/>
-        </w:rPr>
-        <w:t>Response:</w:t>
-      </w:r>
-      <w:r>
-        <w:rPr>
-          <w:highlight w:val="black"/>
-        </w:rPr>
-        <w:tab/>
-      </w:r>
-    </w:p>
-    <w:p>
-      <w:pPr>
-        <w:pStyle w:val="Responsestyle"/>
-        <w:rPr>
-          <w:highlight w:val="black"/>
-        </w:rPr>
-      </w:pPr>
-      <w:r>
-        <w:rPr>
-          <w:highlight w:val="black"/>
-        </w:rPr>
-        <w:t>“</w:t>
-      </w:r>
-      <w:proofErr w:type="spellStart"/>
-      <w:proofErr w:type="gramStart"/>
-      <w:r>
-        <w:rPr>
-          <w:highlight w:val="black"/>
-        </w:rPr>
-        <w:t>lrgate</w:t>
-      </w:r>
-      <w:proofErr w:type="spellEnd"/>
-      <w:proofErr w:type="gramEnd"/>
-      <w:r>
-        <w:rPr>
-          <w:highlight w:val="black"/>
-        </w:rPr>
-        <w:t xml:space="preserve"> </w:t>
-      </w:r>
-      <w:proofErr w:type="spellStart"/>
-      <w:r>
-        <w:rPr>
-          <w:highlight w:val="black"/>
-        </w:rPr>
-        <w:t>usr</w:t>
-      </w:r>
-      <w:proofErr w:type="spellEnd"/>
-      <w:r>
-        <w:rPr>
-          <w:highlight w:val="black"/>
-        </w:rPr>
-        <w:t xml:space="preserve"> &lt;id&gt; &lt;value&gt;\r"</w:t>
-      </w:r>
-    </w:p>
-    <w:p>
-      <w:pPr>
-        <w:rPr>
-          <w:highlight w:val="black"/>
-        </w:rPr>
-      </w:pPr>
-      <w:r>
-        <w:rPr>
-          <w:highlight w:val="black"/>
-        </w:rPr>
-        <w:t>ERROR response:</w:t>
-      </w:r>
-    </w:p>
-    <w:p>
-      <w:pPr>
-        <w:pStyle w:val="Responsestyle"/>
-        <w:rPr>
-          <w:highlight w:val="black"/>
-        </w:rPr>
-      </w:pPr>
-      <w:r>
-        <w:rPr>
-          <w:highlight w:val="black"/>
-        </w:rPr>
-        <w:t>“</w:t>
-      </w:r>
-      <w:proofErr w:type="spellStart"/>
-      <w:proofErr w:type="gramStart"/>
-      <w:r>
-        <w:rPr>
-          <w:highlight w:val="black"/>
-        </w:rPr>
-        <w:t>lrgate</w:t>
-      </w:r>
-      <w:proofErr w:type="spellEnd"/>
-      <w:proofErr w:type="gramEnd"/>
-      <w:r>
-        <w:rPr>
-          <w:highlight w:val="black"/>
-        </w:rPr>
-        <w:t xml:space="preserve"> </w:t>
-      </w:r>
-      <w:proofErr w:type="spellStart"/>
-      <w:r>
-        <w:rPr>
-          <w:highlight w:val="black"/>
-        </w:rPr>
-        <w:t>usr</w:t>
-      </w:r>
-      <w:proofErr w:type="spellEnd"/>
-      <w:r>
-        <w:rPr>
-          <w:highlight w:val="black"/>
-        </w:rPr>
-        <w:t xml:space="preserve"> &lt;id&gt; ERR\r”</w:t>
-      </w:r>
-    </w:p>
-    <w:p>
-      <w:pPr>
-        <w:rPr>
-          <w:highlight w:val="black"/>
-        </w:rPr>
-      </w:pPr>
-    </w:p>
-    <w:p>
-      <w:pPr>
-        <w:rPr>
-          <w:highlight w:val="black"/>
-        </w:rPr>
-      </w:pPr>
-      <w:r>
-        <w:rPr>
-          <w:highlight w:val="black"/>
-        </w:rPr>
-        <w:t xml:space="preserve">Where: </w:t>
-      </w:r>
-    </w:p>
-    <w:p>
-      <w:pPr>
-        <w:pStyle w:val="a0"/>
-        <w:numPr>
-          <w:ilvl w:val="0"/>
-          <w:numId w:val="11"/>
-        </w:numPr>
-        <w:rPr>
-          <w:highlight w:val="black"/>
-        </w:rPr>
-      </w:pPr>
-      <w:r>
-        <w:rPr>
-          <w:highlight w:val="black"/>
-        </w:rPr>
-        <w:t>&lt;id&gt; - device id, (int); always 0.</w:t>
-      </w:r>
-    </w:p>
-    <w:p>
-      <w:pPr>
-        <w:pStyle w:val="a0"/>
-        <w:numPr>
-          <w:ilvl w:val="0"/>
-          <w:numId w:val="11"/>
-        </w:numPr>
-        <w:rPr>
-          <w:highlight w:val="black"/>
-        </w:rPr>
-      </w:pPr>
-      <w:r>
-        <w:rPr>
-          <w:highlight w:val="black"/>
-        </w:rPr>
-        <w:t xml:space="preserve">&lt;value&gt; - </w:t>
-      </w:r>
-      <w:r>
-        <w:rPr>
-          <w:highlight w:val="black"/>
-        </w:rPr>
-        <w:t>gate mode value</w:t>
-      </w:r>
-      <w:r>
-        <w:rPr>
-          <w:highlight w:val="black"/>
-        </w:rPr>
-        <w:t xml:space="preserve">, </w:t>
-      </w:r>
-      <w:r>
-        <w:rPr>
-          <w:highlight w:val="black"/>
-        </w:rPr>
-        <w:t xml:space="preserve">(int) </w:t>
-      </w:r>
-      <w:r>
-        <w:rPr>
-          <w:highlight w:val="black"/>
-        </w:rPr>
-        <w:t>1 – turn on, 0 – turn off.</w:t>
-      </w:r>
-    </w:p>
-    <w:p>
-      <w:pPr>
-        <w:rPr>
-          <w:highlight w:val="black"/>
-        </w:rPr>
-      </w:pPr>
-    </w:p>
-    <w:p>
-      <w:pPr>
-        <w:pStyle w:val="20"/>
-        <w:rPr>
-          <w:highlight w:val="black"/>
-        </w:rPr>
-      </w:pPr>
-      <w:bookmarkStart w:id="14" w:name="_Toc226291978"/>
-      <w:r>
-        <w:rPr>
-          <w:highlight w:val="black"/>
-        </w:rPr>
-        <w:t>Request set output power</w:t>
-      </w:r>
-      <w:bookmarkEnd w:id="14"/>
-    </w:p>
-    <w:p>
-      <w:pPr>
-        <w:pStyle w:val="Requeststyle"/>
-        <w:rPr>
-          <w:highlight w:val="black"/>
-        </w:rPr>
-      </w:pPr>
-      <w:r>
-        <w:rPr>
-          <w:highlight w:val="black"/>
-        </w:rPr>
-        <w:t>"</w:t>
-      </w:r>
-      <w:proofErr w:type="spellStart"/>
-      <w:r>
-        <w:rPr>
-          <w:highlight w:val="black"/>
-        </w:rPr>
-        <w:t>lspower</w:t>
-      </w:r>
-      <w:proofErr w:type="spellEnd"/>
-      <w:r>
-        <w:rPr>
-          <w:highlight w:val="black"/>
-        </w:rPr>
-        <w:t xml:space="preserve"> </w:t>
-      </w:r>
-      <w:proofErr w:type="spellStart"/>
-      <w:r>
-        <w:rPr>
-          <w:highlight w:val="black"/>
-        </w:rPr>
-        <w:t>usr</w:t>
-      </w:r>
-      <w:proofErr w:type="spellEnd"/>
-      <w:r>
-        <w:rPr>
-          <w:highlight w:val="black"/>
-        </w:rPr>
-        <w:t xml:space="preserve"> &lt;id&gt; &lt;</w:t>
-      </w:r>
-      <w:proofErr w:type="spellStart"/>
-      <w:r>
-        <w:rPr>
-          <w:highlight w:val="black"/>
-        </w:rPr>
-        <w:t>set_power</w:t>
-      </w:r>
-      <w:proofErr w:type="spellEnd"/>
-      <w:r>
-        <w:rPr>
-          <w:highlight w:val="black"/>
-        </w:rPr>
-        <w:t>&gt;\r"</w:t>
-      </w:r>
-    </w:p>
-    <w:p>
-      <w:pPr>
-        <w:spacing w:before="120" w:after="40"/>
-        <w:rPr>
-          <w:rFonts w:cs="Arial"/>
-          <w:highlight w:val="black"/>
-        </w:rPr>
-      </w:pPr>
-      <w:r>
-        <w:rPr>
-          <w:rFonts w:cs="Arial"/>
-          <w:highlight w:val="black"/>
-        </w:rPr>
-        <w:t>Response:</w:t>
-      </w:r>
-    </w:p>
-    <w:p>
-      <w:pPr>
-        <w:pStyle w:val="Responsestyle"/>
-        <w:rPr>
-          <w:rFonts w:ascii="Arial" w:hAnsi="Arial"/>
-          <w:highlight w:val="black"/>
-        </w:rPr>
-      </w:pPr>
-      <w:r>
-        <w:rPr>
-          <w:highlight w:val="black"/>
-        </w:rPr>
-        <w:t>"</w:t>
-      </w:r>
-      <w:proofErr w:type="spellStart"/>
-      <w:r>
-        <w:rPr>
-          <w:highlight w:val="black"/>
-        </w:rPr>
-        <w:t>lspower</w:t>
-      </w:r>
-      <w:proofErr w:type="spellEnd"/>
-      <w:r>
-        <w:rPr>
-          <w:highlight w:val="black"/>
-        </w:rPr>
-        <w:t xml:space="preserve"> </w:t>
-      </w:r>
-      <w:proofErr w:type="spellStart"/>
-      <w:r>
-        <w:rPr>
-          <w:highlight w:val="black"/>
-        </w:rPr>
-        <w:t>usr</w:t>
-      </w:r>
-      <w:proofErr w:type="spellEnd"/>
-      <w:r>
-        <w:rPr>
-          <w:highlight w:val="black"/>
-        </w:rPr>
-        <w:t xml:space="preserve"> &lt;id&gt; &lt;</w:t>
-      </w:r>
-      <w:proofErr w:type="spellStart"/>
-      <w:r>
-        <w:rPr>
-          <w:highlight w:val="black"/>
-        </w:rPr>
-        <w:t>set_power</w:t>
-      </w:r>
-      <w:proofErr w:type="spellEnd"/>
-      <w:r>
-        <w:rPr>
-          <w:highlight w:val="black"/>
-        </w:rPr>
-        <w:t>&gt;\r"</w:t>
-      </w:r>
-    </w:p>
-    <w:p>
-      <w:pPr>
-        <w:spacing w:before="120" w:after="40"/>
-        <w:rPr>
-          <w:rFonts w:cs="Arial"/>
-          <w:highlight w:val="black"/>
-        </w:rPr>
-      </w:pPr>
-      <w:r>
-        <w:rPr>
-          <w:rFonts w:cs="Arial"/>
-          <w:highlight w:val="black"/>
-        </w:rPr>
-        <w:t>ERROR response:</w:t>
-      </w:r>
-    </w:p>
-    <w:p>
-      <w:pPr>
-        <w:pStyle w:val="Responsestyle"/>
-        <w:rPr>
-          <w:highlight w:val="black"/>
-        </w:rPr>
-      </w:pPr>
-      <w:r>
-        <w:rPr>
-          <w:highlight w:val="black"/>
-        </w:rPr>
-        <w:t>"</w:t>
-      </w:r>
-      <w:proofErr w:type="spellStart"/>
-      <w:r>
-        <w:rPr>
-          <w:highlight w:val="black"/>
-        </w:rPr>
-        <w:t>lspower</w:t>
-      </w:r>
-      <w:proofErr w:type="spellEnd"/>
-      <w:r>
-        <w:rPr>
-          <w:highlight w:val="black"/>
-        </w:rPr>
-        <w:t xml:space="preserve"> </w:t>
-      </w:r>
-      <w:proofErr w:type="spellStart"/>
-      <w:r>
-        <w:rPr>
-          <w:highlight w:val="black"/>
-        </w:rPr>
-        <w:t>usr</w:t>
-      </w:r>
-      <w:proofErr w:type="spellEnd"/>
-      <w:r>
-        <w:rPr>
-          <w:highlight w:val="black"/>
-        </w:rPr>
-        <w:t xml:space="preserve"> &lt;id&gt; ERR\r" </w:t>
-      </w:r>
-    </w:p>
-    <w:p>
-      <w:pPr>
-        <w:spacing w:before="120" w:after="40"/>
-        <w:rPr>
-          <w:rFonts w:cs="Arial"/>
-          <w:highlight w:val="black"/>
-        </w:rPr>
-      </w:pPr>
-      <w:r>
-        <w:rPr>
-          <w:rFonts w:cs="Arial"/>
-          <w:highlight w:val="black"/>
         </w:rPr>
         <w:t>Where:</w:t>
       </w:r>
@@ -4557,13 +4083,11 @@
         <w:spacing w:after="0"/>
         <w:rPr>
           <w:rFonts w:ascii="Arial" w:hAnsi="Arial" w:cs="Arial"/>
-          <w:highlight w:val="black"/>
         </w:rPr>
       </w:pPr>
       <w:r>
         <w:rPr>
           <w:rFonts w:ascii="Arial" w:hAnsi="Arial" w:cs="Arial"/>
-          <w:highlight w:val="black"/>
         </w:rPr>
         <w:t>&lt;id&gt; - device id (int), 0 if device is single</w:t>
       </w:r>
@@ -4578,331 +4102,199 @@
         <w:spacing w:after="0"/>
         <w:rPr>
           <w:rFonts w:ascii="Arial" w:hAnsi="Arial" w:cs="Arial"/>
-          <w:highlight w:val="black"/>
         </w:rPr>
       </w:pPr>
       <w:r>
         <w:rPr>
           <w:rFonts w:ascii="Arial" w:hAnsi="Arial" w:cs="Arial"/>
-          <w:highlight w:val="black"/>
-        </w:rPr>
+        </w:rPr>
+        <w:t xml:space="preserve">&lt;value&gt; - pulse duration (float), range of values: </w:t>
+      </w:r>
+      <w:r>
+        <w:rPr>
+          <w:rFonts w:ascii="Arial" w:hAnsi="Arial" w:cs="Arial"/>
+        </w:rPr>
+        <w:t>50</w:t>
+      </w:r>
+      <w:r>
+        <w:rPr>
+          <w:rFonts w:ascii="Arial" w:hAnsi="Arial" w:cs="Arial"/>
+        </w:rPr>
+        <w:t xml:space="preserve"> – </w:t>
+      </w:r>
+      <w:r>
+        <w:rPr>
+          <w:rFonts w:ascii="Arial" w:hAnsi="Arial" w:cs="Arial"/>
+        </w:rPr>
+        <w:t>300</w:t>
+      </w:r>
+      <w:r>
+        <w:rPr>
+          <w:rFonts w:ascii="Arial" w:hAnsi="Arial" w:cs="Arial"/>
+        </w:rPr>
+        <w:t xml:space="preserve"> </w:t>
+      </w:r>
+      <w:r>
+        <w:rPr>
+          <w:rFonts w:ascii="Arial" w:hAnsi="Arial" w:cs="Arial"/>
+        </w:rPr>
+        <w:t>u</w:t>
+      </w:r>
+      <w:r>
+        <w:rPr>
+          <w:rFonts w:ascii="Arial" w:hAnsi="Arial" w:cs="Arial"/>
+        </w:rPr>
+        <w:t>s</w:t>
+      </w:r>
+    </w:p>
+    <w:p>
+      <w:pPr>
+        <w:pStyle w:val="Responsestyle"/>
+      </w:pPr>
+    </w:p>
+    <w:p/>
+    <w:p/>
+    <w:p/>
+    <w:p>
+      <w:pPr>
+        <w:pStyle w:val="1"/>
+      </w:pPr>
+      <w:bookmarkStart w:id="14" w:name="_Toc226291980"/>
+      <w:r>
+        <w:t>Admin commands</w:t>
+      </w:r>
+      <w:bookmarkEnd w:id="14"/>
+    </w:p>
+    <w:p>
+      <w:pPr>
+        <w:pStyle w:val="20"/>
+      </w:pPr>
+      <w:bookmarkStart w:id="15" w:name="_Toc226291981"/>
+      <w:r>
+        <w:t>Request set configuration</w:t>
+      </w:r>
+      <w:bookmarkEnd w:id="15"/>
+    </w:p>
+    <w:p>
+      <w:pPr>
+        <w:pStyle w:val="Requeststyle"/>
+      </w:pPr>
+      <w:r>
+        <w:t>"</w:t>
+      </w:r>
+      <w:proofErr w:type="spellStart"/>
+      <w:r>
+        <w:t>lsconf</w:t>
+      </w:r>
+      <w:proofErr w:type="spellEnd"/>
+      <w:r>
+        <w:t xml:space="preserve"> </w:t>
+      </w:r>
+      <w:proofErr w:type="spellStart"/>
+      <w:r>
+        <w:t>admn</w:t>
+      </w:r>
+      <w:proofErr w:type="spellEnd"/>
+      <w:r>
+        <w:t xml:space="preserve"> &lt;id&gt;</w:t>
+      </w:r>
+      <w:r>
+        <w:t xml:space="preserve"> </w:t>
+      </w:r>
+      <w:r>
+        <w:t xml:space="preserve">&lt;tec_state0&gt; </w:t>
+      </w:r>
+      <w:r>
+        <w:t>&lt;tec_temp</w:t>
+      </w:r>
+      <w:r>
+        <w:t xml:space="preserve">0&gt; &lt;tec_state1&gt; </w:t>
+      </w:r>
+      <w:r>
+        <w:t>&lt;tec_temp</w:t>
+      </w:r>
+      <w:r>
+        <w:t>1&gt; &lt;tec_state</w:t>
+      </w:r>
+      <w:r>
+        <w:t>2</w:t>
+      </w:r>
+      <w:r>
+        <w:t xml:space="preserve">&gt; </w:t>
+      </w:r>
+      <w:r>
+        <w:t>&lt;tec_temp</w:t>
+      </w:r>
+      <w:r>
+        <w:t>2</w:t>
+      </w:r>
+      <w:r>
+        <w:t>&gt; &lt;tec_state</w:t>
+      </w:r>
+      <w:r>
+        <w:t>3</w:t>
+      </w:r>
+      <w:r>
+        <w:t xml:space="preserve">&gt; </w:t>
+      </w:r>
+      <w:r>
+        <w:t>&lt;tec_temp</w:t>
+      </w:r>
+      <w:r>
+        <w:t>3</w:t>
+      </w:r>
+      <w:r>
+        <w:t xml:space="preserve">&gt; </w:t>
+      </w:r>
+      <w:r>
         <w:t>&lt;</w:t>
       </w:r>
       <w:proofErr w:type="spellStart"/>
       <w:r>
-        <w:rPr>
-          <w:rFonts w:ascii="Arial" w:hAnsi="Arial" w:cs="Arial"/>
-          <w:highlight w:val="black"/>
-        </w:rPr>
-        <w:t>set_power</w:t>
-      </w:r>
-      <w:proofErr w:type="spellEnd"/>
-      <w:r>
-        <w:rPr>
-          <w:rFonts w:ascii="Arial" w:hAnsi="Arial" w:cs="Arial"/>
-          <w:highlight w:val="black"/>
-        </w:rPr>
-        <w:t>&gt; - output power value (float), range of values: 0 to 100</w:t>
-      </w:r>
-    </w:p>
-    <w:p>
-      <w:pPr>
-        <w:rPr>
-          <w:highlight w:val="black"/>
-        </w:rPr>
-      </w:pPr>
-    </w:p>
-    <w:p>
-      <w:pPr>
-        <w:pStyle w:val="20"/>
-        <w:rPr>
-          <w:highlight w:val="black"/>
-        </w:rPr>
-      </w:pPr>
-      <w:bookmarkStart w:id="15" w:name="_Toc226291979"/>
-      <w:r>
-        <w:rPr>
-          <w:highlight w:val="black"/>
-        </w:rPr>
-        <w:t xml:space="preserve">Request set </w:t>
-      </w:r>
-      <w:r>
-        <w:rPr>
-          <w:highlight w:val="black"/>
-          <w:lang w:val="fr-FR"/>
-        </w:rPr>
-        <w:t>pulse dur</w:t>
-      </w:r>
-      <w:proofErr w:type="spellStart"/>
-      <w:r>
-        <w:rPr>
-          <w:highlight w:val="black"/>
-        </w:rPr>
-        <w:t>ation</w:t>
-      </w:r>
-      <w:bookmarkEnd w:id="15"/>
-      <w:proofErr w:type="spellEnd"/>
-    </w:p>
-    <w:p>
-      <w:pPr>
-        <w:pStyle w:val="Requeststyle"/>
-        <w:rPr>
-          <w:highlight w:val="black"/>
-        </w:rPr>
-      </w:pPr>
-      <w:r>
-        <w:rPr>
-          <w:highlight w:val="black"/>
-        </w:rPr>
+        <w:t>hpld_curr</w:t>
+      </w:r>
+      <w:proofErr w:type="spellEnd"/>
+      <w:r>
+        <w:t>&gt;</w:t>
+      </w:r>
+      <w:r>
+        <w:t xml:space="preserve"> &lt;tec_max0&gt; &lt;tec_max1&gt; &lt;tec_max2&gt; &lt;tec_max3&gt; &lt;temp_max0&gt; &lt;temp_max1&gt;</w:t>
+      </w:r>
+      <w:r>
+        <w:t>\r"</w:t>
+      </w:r>
+    </w:p>
+    <w:p>
+      <w:pPr>
+        <w:spacing w:before="120" w:after="40"/>
+        <w:rPr>
+          <w:rFonts w:cs="Arial"/>
+        </w:rPr>
+      </w:pPr>
+      <w:r>
+        <w:rPr>
+          <w:rFonts w:cs="Arial"/>
+        </w:rPr>
+        <w:t>Response:</w:t>
+      </w:r>
+    </w:p>
+    <w:p>
+      <w:pPr>
+        <w:pStyle w:val="Responsestyle"/>
+      </w:pPr>
+      <w:r>
         <w:t>"</w:t>
       </w:r>
       <w:proofErr w:type="spellStart"/>
       <w:r>
-        <w:rPr>
-          <w:highlight w:val="black"/>
-        </w:rPr>
-        <w:t>lsdura</w:t>
-      </w:r>
-      <w:proofErr w:type="spellEnd"/>
-      <w:r>
-        <w:rPr>
-          <w:highlight w:val="black"/>
-        </w:rPr>
+        <w:t>lsconf</w:t>
+      </w:r>
+      <w:proofErr w:type="spellEnd"/>
+      <w:r>
         <w:t xml:space="preserve"> </w:t>
       </w:r>
       <w:proofErr w:type="spellStart"/>
       <w:r>
-        <w:rPr>
-          <w:highlight w:val="black"/>
-        </w:rPr>
-        <w:t>usr</w:t>
-      </w:r>
-      <w:proofErr w:type="spellEnd"/>
-      <w:r>
-        <w:rPr>
-          <w:highlight w:val="black"/>
-        </w:rPr>
-        <w:t xml:space="preserve"> &lt;id&gt; &lt;value&gt;\r"</w:t>
-      </w:r>
-    </w:p>
-    <w:p>
-      <w:pPr>
-        <w:spacing w:before="120" w:after="40"/>
-        <w:rPr>
-          <w:rFonts w:cs="Arial"/>
-          <w:highlight w:val="black"/>
-        </w:rPr>
-      </w:pPr>
-      <w:r>
-        <w:rPr>
-          <w:rFonts w:cs="Arial"/>
-          <w:highlight w:val="black"/>
-        </w:rPr>
-        <w:t>Response:</w:t>
-      </w:r>
-    </w:p>
-    <w:p>
-      <w:pPr>
-        <w:pStyle w:val="Responsestyle"/>
-        <w:rPr>
-          <w:rFonts w:ascii="Arial" w:hAnsi="Arial"/>
-          <w:highlight w:val="black"/>
-        </w:rPr>
-      </w:pPr>
-      <w:r>
-        <w:rPr>
-          <w:highlight w:val="black"/>
-        </w:rPr>
-        <w:t>"</w:t>
-      </w:r>
-      <w:proofErr w:type="spellStart"/>
-      <w:r>
-        <w:rPr>
-          <w:highlight w:val="black"/>
-        </w:rPr>
-        <w:t>lsdura</w:t>
-      </w:r>
-      <w:proofErr w:type="spellEnd"/>
-      <w:r>
-        <w:rPr>
-          <w:highlight w:val="black"/>
-        </w:rPr>
-        <w:t xml:space="preserve"> </w:t>
-      </w:r>
-      <w:proofErr w:type="spellStart"/>
-      <w:r>
-        <w:rPr>
-          <w:highlight w:val="black"/>
-        </w:rPr>
-        <w:t>usr</w:t>
-      </w:r>
-      <w:proofErr w:type="spellEnd"/>
-      <w:r>
-        <w:rPr>
-          <w:highlight w:val="black"/>
-        </w:rPr>
-        <w:t xml:space="preserve"> &lt;id&gt; &lt;value&gt;\r"</w:t>
-      </w:r>
-    </w:p>
-    <w:p>
-      <w:pPr>
-        <w:spacing w:before="120" w:after="40"/>
-        <w:rPr>
-          <w:rFonts w:cs="Arial"/>
-          <w:highlight w:val="black"/>
-        </w:rPr>
-      </w:pPr>
-      <w:r>
-        <w:rPr>
-          <w:rFonts w:cs="Arial"/>
-          <w:highlight w:val="black"/>
-        </w:rPr>
-        <w:t>ERROR response:</w:t>
-      </w:r>
-    </w:p>
-    <w:p>
-      <w:pPr>
-        <w:pStyle w:val="Responsestyle"/>
-        <w:rPr>
-          <w:highlight w:val="black"/>
-        </w:rPr>
-      </w:pPr>
-      <w:r>
-        <w:rPr>
-          <w:highlight w:val="black"/>
-        </w:rPr>
-        <w:t>"</w:t>
-      </w:r>
-      <w:proofErr w:type="spellStart"/>
-      <w:r>
-        <w:rPr>
-          <w:highlight w:val="black"/>
-        </w:rPr>
-        <w:t>lsdura</w:t>
-      </w:r>
-      <w:proofErr w:type="spellEnd"/>
-      <w:r>
-        <w:rPr>
-          <w:highlight w:val="black"/>
-        </w:rPr>
-        <w:t xml:space="preserve"> </w:t>
-      </w:r>
-      <w:proofErr w:type="spellStart"/>
-      <w:r>
-        <w:rPr>
-          <w:highlight w:val="black"/>
-        </w:rPr>
-        <w:t>usr</w:t>
-      </w:r>
-      <w:proofErr w:type="spellEnd"/>
-      <w:r>
-        <w:rPr>
-          <w:highlight w:val="black"/>
-        </w:rPr>
-        <w:t xml:space="preserve"> &lt;id&gt; ERR\r" </w:t>
-      </w:r>
-    </w:p>
-    <w:p>
-      <w:pPr>
-        <w:spacing w:before="120" w:after="40"/>
-        <w:rPr>
-          <w:rFonts w:cs="Arial"/>
-          <w:highlight w:val="black"/>
-        </w:rPr>
-      </w:pPr>
-      <w:r>
-        <w:rPr>
-          <w:rFonts w:cs="Arial"/>
-          <w:highlight w:val="black"/>
-        </w:rPr>
-        <w:t>Where:</w:t>
-      </w:r>
-    </w:p>
-    <w:p>
-      <w:pPr>
-        <w:pStyle w:val="a"/>
-        <w:numPr>
-          <w:ilvl w:val="0"/>
-          <w:numId w:val="16"/>
-        </w:numPr>
-        <w:spacing w:after="0"/>
-        <w:rPr>
-          <w:rFonts w:ascii="Arial" w:hAnsi="Arial" w:cs="Arial"/>
-          <w:highlight w:val="black"/>
-        </w:rPr>
-      </w:pPr>
-      <w:r>
-        <w:rPr>
-          <w:rFonts w:ascii="Arial" w:hAnsi="Arial" w:cs="Arial"/>
-          <w:highlight w:val="black"/>
-        </w:rPr>
-        <w:t>&lt;id&gt; - device id (int), 0 if device is single</w:t>
-      </w:r>
-    </w:p>
-    <w:p>
-      <w:pPr>
-        <w:pStyle w:val="a"/>
-        <w:numPr>
-          <w:ilvl w:val="0"/>
-          <w:numId w:val="16"/>
-        </w:numPr>
-        <w:spacing w:after="0"/>
-        <w:rPr>
-          <w:rFonts w:ascii="Arial" w:hAnsi="Arial" w:cs="Arial"/>
-          <w:highlight w:val="black"/>
-        </w:rPr>
-      </w:pPr>
-      <w:r>
-        <w:rPr>
-          <w:rFonts w:ascii="Arial" w:hAnsi="Arial" w:cs="Arial"/>
-          <w:highlight w:val="black"/>
-        </w:rPr>
-        <w:t>&lt;value&gt; - pulse duration (float), range of values: 1.0 – 5.0 ns</w:t>
-      </w:r>
-    </w:p>
-    <w:p>
-      <w:pPr>
-        <w:pStyle w:val="Responsestyle"/>
-      </w:pPr>
-    </w:p>
-    <w:p/>
-    <w:p>
-      <w:pPr>
-        <w:pStyle w:val="1"/>
-      </w:pPr>
-      <w:bookmarkStart w:id="16" w:name="_Toc226291980"/>
-      <w:r>
-        <w:t>Admin commands</w:t>
-      </w:r>
-      <w:bookmarkEnd w:id="16"/>
-    </w:p>
-    <w:p>
-      <w:pPr>
-        <w:pStyle w:val="20"/>
-      </w:pPr>
-      <w:bookmarkStart w:id="17" w:name="_Toc226291981"/>
-      <w:r>
-        <w:t>Request set configuration</w:t>
-      </w:r>
-      <w:bookmarkEnd w:id="17"/>
-    </w:p>
-    <w:p>
-      <w:pPr>
-        <w:pStyle w:val="Requeststyle"/>
-      </w:pPr>
-      <w:r>
-        <w:t>"</w:t>
-      </w:r>
-      <w:proofErr w:type="spellStart"/>
-      <w:r>
-        <w:t>lsconf</w:t>
-      </w:r>
-      <w:proofErr w:type="spellEnd"/>
-      <w:r>
-        <w:t xml:space="preserve"> </w:t>
-      </w:r>
-      <w:proofErr w:type="spellStart"/>
-      <w:r>
         <w:t>admn</w:t>
       </w:r>
       <w:proofErr w:type="spellEnd"/>
@@ -4910,10 +4302,10 @@
         <w:t xml:space="preserve"> &lt;id&gt;</w:t>
       </w:r>
       <w:r>
-        <w:t xml:space="preserve"> </w:t>
-      </w:r>
-      <w:r>
-        <w:t xml:space="preserve">&lt;tec_state0&gt; </w:t>
+        <w:t xml:space="preserve"> &lt;</w:t>
+      </w:r>
+      <w:r>
+        <w:t xml:space="preserve">tec_state0&gt; </w:t>
       </w:r>
       <w:r>
         <w:t>&lt;tec_temp</w:t>
@@ -4966,105 +4358,10 @@
       </w:r>
       <w:proofErr w:type="spellEnd"/>
       <w:r>
-        <w:t>&gt;\r"</w:t>
-      </w:r>
-    </w:p>
-    <w:p>
-      <w:pPr>
-        <w:spacing w:before="120" w:after="40"/>
-        <w:rPr>
-          <w:rFonts w:cs="Arial"/>
-        </w:rPr>
-      </w:pPr>
-      <w:r>
-        <w:rPr>
-          <w:rFonts w:cs="Arial"/>
-        </w:rPr>
-        <w:t>Response:</w:t>
-      </w:r>
-    </w:p>
-    <w:p>
-      <w:pPr>
-        <w:pStyle w:val="Responsestyle"/>
-      </w:pPr>
-      <w:r>
-        <w:lastRenderedPageBreak/>
-        <w:t>"</w:t>
-      </w:r>
-      <w:proofErr w:type="spellStart"/>
-      <w:r>
-        <w:t>lsconf</w:t>
-      </w:r>
-      <w:proofErr w:type="spellEnd"/>
-      <w:r>
-        <w:t xml:space="preserve"> </w:t>
-      </w:r>
-      <w:proofErr w:type="spellStart"/>
-      <w:r>
-        <w:t>admn</w:t>
-      </w:r>
-      <w:proofErr w:type="spellEnd"/>
-      <w:r>
-        <w:t xml:space="preserve"> &lt;id&gt;</w:t>
-      </w:r>
-      <w:r>
-        <w:t xml:space="preserve"> &lt;</w:t>
-      </w:r>
-      <w:r>
-        <w:t xml:space="preserve">tec_state0&gt; </w:t>
-      </w:r>
-      <w:r>
-        <w:t>&lt;tec_temp</w:t>
-      </w:r>
-      <w:r>
-        <w:t xml:space="preserve">0&gt; &lt;tec_state1&gt; </w:t>
-      </w:r>
-      <w:r>
-        <w:t>&lt;tec_temp</w:t>
-      </w:r>
-      <w:r>
-        <w:t>1&gt; &lt;tec_state</w:t>
-      </w:r>
-      <w:r>
-        <w:t>2</w:t>
-      </w:r>
-      <w:r>
-        <w:t xml:space="preserve">&gt; </w:t>
-      </w:r>
-      <w:r>
-        <w:t>&lt;tec_temp</w:t>
-      </w:r>
-      <w:r>
-        <w:t>2</w:t>
-      </w:r>
-      <w:r>
-        <w:t>&gt; &lt;tec_state</w:t>
-      </w:r>
-      <w:r>
-        <w:t>3</w:t>
-      </w:r>
-      <w:r>
-        <w:t xml:space="preserve">&gt; </w:t>
-      </w:r>
-      <w:r>
-        <w:t>&lt;tec_temp</w:t>
-      </w:r>
-      <w:r>
-        <w:t>3</w:t>
-      </w:r>
-      <w:r>
-        <w:t xml:space="preserve">&gt; </w:t>
-      </w:r>
-      <w:r>
-        <w:t>&lt;</w:t>
-      </w:r>
-      <w:proofErr w:type="spellStart"/>
-      <w:r>
-        <w:t>hpld_curr</w:t>
-      </w:r>
-      <w:proofErr w:type="spellEnd"/>
-      <w:r>
         <w:t>&gt;</w:t>
+      </w:r>
+      <w:r>
+        <w:t xml:space="preserve"> &lt;tec_max0&gt; &lt;tec_max1&gt; &lt;tec_max2&gt; &lt;tec_max3&gt; &lt;temp_max0&gt; &lt;temp_max1&gt;</w:t>
       </w:r>
       <w:r>
         <w:t>\r"</w:t>
@@ -5200,7 +4497,19 @@
         <w:t xml:space="preserve"> TEC temperature setpoint (float), </w:t>
       </w:r>
       <w:r>
-        <w:t>10.0 – 200.0 C</w:t>
+        <w:t>10.0</w:t>
+      </w:r>
+      <w:r>
+        <w:t>0</w:t>
+      </w:r>
+      <w:r>
+        <w:t xml:space="preserve"> – 200.0</w:t>
+      </w:r>
+      <w:r>
+        <w:t>0</w:t>
+      </w:r>
+      <w:r>
+        <w:t xml:space="preserve"> C</w:t>
       </w:r>
     </w:p>
     <w:p>
@@ -5232,183 +4541,6 @@
         <w:t>0.00 – 26.00 A</w:t>
       </w:r>
     </w:p>
-    <w:p/>
-    <w:p/>
-    <w:p>
-      <w:pPr>
-        <w:pStyle w:val="20"/>
-      </w:pPr>
-      <w:bookmarkStart w:id="18" w:name="_Toc226291982"/>
-      <w:r>
-        <w:t>Request get configuration</w:t>
-      </w:r>
-      <w:bookmarkEnd w:id="18"/>
-    </w:p>
-    <w:p>
-      <w:pPr>
-        <w:pStyle w:val="Requeststyle"/>
-      </w:pPr>
-      <w:r>
-        <w:t>"</w:t>
-      </w:r>
-      <w:proofErr w:type="spellStart"/>
-      <w:proofErr w:type="gramStart"/>
-      <w:r>
-        <w:t>lgconf</w:t>
-      </w:r>
-      <w:proofErr w:type="spellEnd"/>
-      <w:proofErr w:type="gramEnd"/>
-      <w:r>
-        <w:t xml:space="preserve"> </w:t>
-      </w:r>
-      <w:proofErr w:type="spellStart"/>
-      <w:r>
-        <w:t>admn</w:t>
-      </w:r>
-      <w:proofErr w:type="spellEnd"/>
-      <w:r>
-        <w:t xml:space="preserve"> &lt;id&gt;\r"</w:t>
-      </w:r>
-    </w:p>
-    <w:p>
-      <w:pPr>
-        <w:spacing w:before="120" w:after="40"/>
-        <w:rPr>
-          <w:rFonts w:cs="Arial"/>
-        </w:rPr>
-      </w:pPr>
-      <w:r>
-        <w:rPr>
-          <w:rFonts w:cs="Arial"/>
-        </w:rPr>
-        <w:t>Response:</w:t>
-      </w:r>
-    </w:p>
-    <w:p>
-      <w:pPr>
-        <w:pStyle w:val="Responsestyle"/>
-      </w:pPr>
-      <w:r>
-        <w:t>"</w:t>
-      </w:r>
-      <w:proofErr w:type="spellStart"/>
-      <w:r>
-        <w:t>lsconf</w:t>
-      </w:r>
-      <w:proofErr w:type="spellEnd"/>
-      <w:r>
-        <w:t xml:space="preserve"> </w:t>
-      </w:r>
-      <w:proofErr w:type="spellStart"/>
-      <w:r>
-        <w:t>admn</w:t>
-      </w:r>
-      <w:proofErr w:type="spellEnd"/>
-      <w:r>
-        <w:t xml:space="preserve"> &lt;id&gt;</w:t>
-      </w:r>
-      <w:r>
-        <w:t xml:space="preserve"> &lt;tec_state0&gt; </w:t>
-      </w:r>
-      <w:r>
-        <w:t>&lt;tec_temp</w:t>
-      </w:r>
-      <w:r>
-        <w:t xml:space="preserve">0&gt; &lt;tec_state1&gt; </w:t>
-      </w:r>
-      <w:r>
-        <w:t>&lt;tec_temp</w:t>
-      </w:r>
-      <w:r>
-        <w:t>1&gt; &lt;tec_state</w:t>
-      </w:r>
-      <w:r>
-        <w:t>2</w:t>
-      </w:r>
-      <w:r>
-        <w:t xml:space="preserve">&gt; </w:t>
-      </w:r>
-      <w:r>
-        <w:t>&lt;tec_temp</w:t>
-      </w:r>
-      <w:r>
-        <w:t>2</w:t>
-      </w:r>
-      <w:r>
-        <w:t>&gt; &lt;tec_state</w:t>
-      </w:r>
-      <w:r>
-        <w:t>3</w:t>
-      </w:r>
-      <w:r>
-        <w:t xml:space="preserve">&gt; </w:t>
-      </w:r>
-      <w:r>
-        <w:t>&lt;tec_temp</w:t>
-      </w:r>
-      <w:r>
-        <w:t>3</w:t>
-      </w:r>
-      <w:r>
-        <w:t xml:space="preserve">&gt; </w:t>
-      </w:r>
-      <w:r>
-        <w:t>&lt;</w:t>
-      </w:r>
-      <w:proofErr w:type="spellStart"/>
-      <w:r>
-        <w:t>hpld_curr</w:t>
-      </w:r>
-      <w:proofErr w:type="spellEnd"/>
-      <w:r>
-        <w:t>&gt;\r"</w:t>
-      </w:r>
-    </w:p>
-    <w:p>
-      <w:pPr>
-        <w:spacing w:before="120" w:after="40"/>
-        <w:rPr>
-          <w:rFonts w:cs="Arial"/>
-        </w:rPr>
-      </w:pPr>
-      <w:r>
-        <w:rPr>
-          <w:rFonts w:cs="Arial"/>
-        </w:rPr>
-        <w:t>ERROR response:</w:t>
-      </w:r>
-    </w:p>
-    <w:p>
-      <w:pPr>
-        <w:pStyle w:val="Responsestyle"/>
-      </w:pPr>
-      <w:r>
-        <w:t>"</w:t>
-      </w:r>
-      <w:proofErr w:type="spellStart"/>
-      <w:proofErr w:type="gramStart"/>
-      <w:r>
-        <w:t>lrconf</w:t>
-      </w:r>
-      <w:proofErr w:type="spellEnd"/>
-      <w:proofErr w:type="gramEnd"/>
-      <w:r>
-        <w:t xml:space="preserve"> </w:t>
-      </w:r>
-      <w:proofErr w:type="spellStart"/>
-      <w:r>
-        <w:t>admn</w:t>
-      </w:r>
-      <w:proofErr w:type="spellEnd"/>
-      <w:r>
-        <w:t xml:space="preserve"> &lt;id&gt; ERR\r"</w:t>
-      </w:r>
-    </w:p>
-    <w:p>
-      <w:r>
-        <w:t>Where:</w:t>
-      </w:r>
-    </w:p>
     <w:p>
       <w:pPr>
         <w:pStyle w:val="a0"/>
@@ -5418,7 +4550,18 @@
         </w:numPr>
       </w:pPr>
       <w:r>
-        <w:t>&lt;id&gt; - device id (int), 0 if device is single</w:t>
+        <w:t>&lt;</w:t>
+      </w:r>
+      <w:proofErr w:type="spellStart"/>
+      <w:r>
+        <w:t>tec_maxN</w:t>
+      </w:r>
+      <w:proofErr w:type="spellEnd"/>
+      <w:r>
+        <w:t>&gt; - N TEC max temperature value</w:t>
+      </w:r>
+      <w:r>
+        <w:t xml:space="preserve"> (float), 0.00 – 200.00 C</w:t>
       </w:r>
     </w:p>
     <w:p>
@@ -5434,35 +4577,197 @@
       </w:r>
       <w:proofErr w:type="spellStart"/>
       <w:r>
-        <w:t>tec_</w:t>
-      </w:r>
-      <w:r>
-        <w:t>stateN</w:t>
-      </w:r>
-      <w:proofErr w:type="spellEnd"/>
-      <w:r>
-        <w:t>&gt; -</w:t>
-      </w:r>
-      <w:r>
-        <w:t xml:space="preserve"> N</w:t>
-      </w:r>
-      <w:r>
-        <w:t xml:space="preserve"> TEC </w:t>
-      </w:r>
-      <w:r>
-        <w:t>state value</w:t>
-      </w:r>
-      <w:r>
-        <w:t xml:space="preserve"> (</w:t>
-      </w:r>
-      <w:r>
-        <w:t>int</w:t>
-      </w:r>
-      <w:r>
-        <w:t xml:space="preserve">), </w:t>
-      </w:r>
-      <w:r>
-        <w:t>0 – off, 1 – on</w:t>
+        <w:t>temp_maxN</w:t>
+      </w:r>
+      <w:proofErr w:type="spellEnd"/>
+      <w:r>
+        <w:t>&gt; - N temperature max value</w:t>
+      </w:r>
+      <w:r>
+        <w:t xml:space="preserve"> (float), 0.00 – 200.00 C</w:t>
+      </w:r>
+    </w:p>
+    <w:p/>
+    <w:p>
+      <w:pPr>
+        <w:pStyle w:val="20"/>
+      </w:pPr>
+      <w:bookmarkStart w:id="16" w:name="_Toc226291982"/>
+      <w:r>
+        <w:t>Request get configuration</w:t>
+      </w:r>
+      <w:bookmarkEnd w:id="16"/>
+    </w:p>
+    <w:p>
+      <w:pPr>
+        <w:pStyle w:val="Requeststyle"/>
+      </w:pPr>
+      <w:r>
+        <w:t>"</w:t>
+      </w:r>
+      <w:proofErr w:type="spellStart"/>
+      <w:proofErr w:type="gramStart"/>
+      <w:r>
+        <w:t>lgconf</w:t>
+      </w:r>
+      <w:proofErr w:type="spellEnd"/>
+      <w:proofErr w:type="gramEnd"/>
+      <w:r>
+        <w:t xml:space="preserve"> </w:t>
+      </w:r>
+      <w:proofErr w:type="spellStart"/>
+      <w:r>
+        <w:t>admn</w:t>
+      </w:r>
+      <w:proofErr w:type="spellEnd"/>
+      <w:r>
+        <w:t xml:space="preserve"> &lt;id&gt;\r"</w:t>
+      </w:r>
+    </w:p>
+    <w:p>
+      <w:pPr>
+        <w:spacing w:before="120" w:after="40"/>
+        <w:rPr>
+          <w:rFonts w:cs="Arial"/>
+        </w:rPr>
+      </w:pPr>
+      <w:r>
+        <w:rPr>
+          <w:rFonts w:cs="Arial"/>
+        </w:rPr>
+        <w:t>Response:</w:t>
+      </w:r>
+    </w:p>
+    <w:p>
+      <w:pPr>
+        <w:pStyle w:val="Responsestyle"/>
+      </w:pPr>
+      <w:r>
+        <w:t>"</w:t>
+      </w:r>
+      <w:proofErr w:type="spellStart"/>
+      <w:r>
+        <w:t>lsconf</w:t>
+      </w:r>
+      <w:proofErr w:type="spellEnd"/>
+      <w:r>
+        <w:t xml:space="preserve"> </w:t>
+      </w:r>
+      <w:proofErr w:type="spellStart"/>
+      <w:r>
+        <w:t>admn</w:t>
+      </w:r>
+      <w:proofErr w:type="spellEnd"/>
+      <w:r>
+        <w:t xml:space="preserve"> &lt;id&gt;</w:t>
+      </w:r>
+      <w:r>
+        <w:t xml:space="preserve"> &lt;tec_state0&gt; </w:t>
+      </w:r>
+      <w:r>
+        <w:t>&lt;tec_temp</w:t>
+      </w:r>
+      <w:r>
+        <w:t xml:space="preserve">0&gt; &lt;tec_state1&gt; </w:t>
+      </w:r>
+      <w:r>
+        <w:t>&lt;tec_temp</w:t>
+      </w:r>
+      <w:r>
+        <w:t>1&gt; &lt;tec_state</w:t>
+      </w:r>
+      <w:r>
+        <w:t>2</w:t>
+      </w:r>
+      <w:r>
+        <w:t xml:space="preserve">&gt; </w:t>
+      </w:r>
+      <w:r>
+        <w:t>&lt;tec_temp</w:t>
+      </w:r>
+      <w:r>
+        <w:t>2</w:t>
+      </w:r>
+      <w:r>
+        <w:t>&gt; &lt;tec_state</w:t>
+      </w:r>
+      <w:r>
+        <w:t>3</w:t>
+      </w:r>
+      <w:r>
+        <w:t xml:space="preserve">&gt; </w:t>
+      </w:r>
+      <w:r>
+        <w:t>&lt;tec_temp</w:t>
+      </w:r>
+      <w:r>
+        <w:t>3</w:t>
+      </w:r>
+      <w:r>
+        <w:t xml:space="preserve">&gt; </w:t>
+      </w:r>
+      <w:r>
+        <w:t>&lt;</w:t>
+      </w:r>
+      <w:proofErr w:type="spellStart"/>
+      <w:r>
+        <w:t>hpld_curr</w:t>
+      </w:r>
+      <w:proofErr w:type="spellEnd"/>
+      <w:r>
+        <w:t>&gt;</w:t>
+      </w:r>
+      <w:r>
+        <w:t xml:space="preserve"> &lt;tec_max0&gt; &lt;tec_max1&gt; &lt;tec_max2&gt; &lt;tec_max3&gt; &lt;temp_max0&gt; &lt;temp_max1&gt;</w:t>
+      </w:r>
+      <w:r>
+        <w:t>\r"</w:t>
+      </w:r>
+    </w:p>
+    <w:p>
+      <w:pPr>
+        <w:spacing w:before="120" w:after="40"/>
+        <w:rPr>
+          <w:rFonts w:cs="Arial"/>
+        </w:rPr>
+      </w:pPr>
+      <w:r>
+        <w:rPr>
+          <w:rFonts w:cs="Arial"/>
+        </w:rPr>
+        <w:lastRenderedPageBreak/>
+        <w:t>ERROR response:</w:t>
+      </w:r>
+    </w:p>
+    <w:p>
+      <w:pPr>
+        <w:pStyle w:val="Responsestyle"/>
+      </w:pPr>
+      <w:r>
+        <w:t>"</w:t>
+      </w:r>
+      <w:proofErr w:type="spellStart"/>
+      <w:proofErr w:type="gramStart"/>
+      <w:r>
+        <w:t>lrconf</w:t>
+      </w:r>
+      <w:proofErr w:type="spellEnd"/>
+      <w:proofErr w:type="gramEnd"/>
+      <w:r>
+        <w:t xml:space="preserve"> </w:t>
+      </w:r>
+      <w:proofErr w:type="spellStart"/>
+      <w:r>
+        <w:t>admn</w:t>
+      </w:r>
+      <w:proofErr w:type="spellEnd"/>
+      <w:r>
+        <w:t xml:space="preserve"> &lt;id&gt; ERR\r"</w:t>
+      </w:r>
+    </w:p>
+    <w:p>
+      <w:r>
+        <w:t>Where:</w:t>
       </w:r>
     </w:p>
     <w:p>
@@ -5474,27 +4779,7 @@
         </w:numPr>
       </w:pPr>
       <w:r>
-        <w:t>&lt;</w:t>
-      </w:r>
-      <w:proofErr w:type="spellStart"/>
-      <w:r>
-        <w:t>tec_temp</w:t>
-      </w:r>
-      <w:r>
-        <w:t>N</w:t>
-      </w:r>
-      <w:proofErr w:type="spellEnd"/>
-      <w:r>
-        <w:t>&gt; -</w:t>
-      </w:r>
-      <w:r>
-        <w:t xml:space="preserve"> N</w:t>
-      </w:r>
-      <w:r>
-        <w:t xml:space="preserve"> TEC temperature setpoint (float), </w:t>
-      </w:r>
-      <w:r>
-        <w:t>10.0 – 200.0 C</w:t>
+        <w:t>&lt;id&gt; - device id (int), 0 if device is single</w:t>
       </w:r>
     </w:p>
     <w:p>
@@ -5510,6 +4795,82 @@
       </w:r>
       <w:proofErr w:type="spellStart"/>
       <w:r>
+        <w:t>tec_</w:t>
+      </w:r>
+      <w:r>
+        <w:t>stateN</w:t>
+      </w:r>
+      <w:proofErr w:type="spellEnd"/>
+      <w:r>
+        <w:t>&gt; -</w:t>
+      </w:r>
+      <w:r>
+        <w:t xml:space="preserve"> N</w:t>
+      </w:r>
+      <w:r>
+        <w:t xml:space="preserve"> TEC </w:t>
+      </w:r>
+      <w:r>
+        <w:t>state value</w:t>
+      </w:r>
+      <w:r>
+        <w:t xml:space="preserve"> (</w:t>
+      </w:r>
+      <w:r>
+        <w:t>int</w:t>
+      </w:r>
+      <w:r>
+        <w:t xml:space="preserve">), </w:t>
+      </w:r>
+      <w:r>
+        <w:t>0 – off, 1 – on</w:t>
+      </w:r>
+    </w:p>
+    <w:p>
+      <w:pPr>
+        <w:pStyle w:val="a0"/>
+        <w:numPr>
+          <w:ilvl w:val="0"/>
+          <w:numId w:val="23"/>
+        </w:numPr>
+      </w:pPr>
+      <w:r>
+        <w:t>&lt;</w:t>
+      </w:r>
+      <w:proofErr w:type="spellStart"/>
+      <w:r>
+        <w:t>tec_temp</w:t>
+      </w:r>
+      <w:r>
+        <w:t>N</w:t>
+      </w:r>
+      <w:proofErr w:type="spellEnd"/>
+      <w:r>
+        <w:t>&gt; -</w:t>
+      </w:r>
+      <w:r>
+        <w:t xml:space="preserve"> N</w:t>
+      </w:r>
+      <w:r>
+        <w:t xml:space="preserve"> TEC temperature setpoint (float), </w:t>
+      </w:r>
+      <w:r>
+        <w:t>10.00 – 200.00 C</w:t>
+      </w:r>
+    </w:p>
+    <w:p>
+      <w:pPr>
+        <w:pStyle w:val="a0"/>
+        <w:numPr>
+          <w:ilvl w:val="0"/>
+          <w:numId w:val="23"/>
+        </w:numPr>
+      </w:pPr>
+      <w:r>
+        <w:t>&lt;</w:t>
+      </w:r>
+      <w:proofErr w:type="spellStart"/>
+      <w:r>
         <w:t>hpld_curr</w:t>
       </w:r>
       <w:proofErr w:type="spellEnd"/>
@@ -5524,6 +4885,52 @@
       </w:r>
       <w:r>
         <w:t>0.00 – 26.00 A</w:t>
+      </w:r>
+    </w:p>
+    <w:p>
+      <w:pPr>
+        <w:pStyle w:val="a0"/>
+        <w:numPr>
+          <w:ilvl w:val="0"/>
+          <w:numId w:val="23"/>
+        </w:numPr>
+      </w:pPr>
+      <w:r>
+        <w:t>&lt;</w:t>
+      </w:r>
+      <w:proofErr w:type="spellStart"/>
+      <w:r>
+        <w:t>tec_maxN</w:t>
+      </w:r>
+      <w:proofErr w:type="spellEnd"/>
+      <w:r>
+        <w:t>&gt; - N TEC max temperature value</w:t>
+      </w:r>
+      <w:r>
+        <w:t xml:space="preserve"> (float), 0.00 – 200.00 C</w:t>
+      </w:r>
+    </w:p>
+    <w:p>
+      <w:pPr>
+        <w:pStyle w:val="a0"/>
+        <w:numPr>
+          <w:ilvl w:val="0"/>
+          <w:numId w:val="23"/>
+        </w:numPr>
+      </w:pPr>
+      <w:r>
+        <w:t>&lt;</w:t>
+      </w:r>
+      <w:proofErr w:type="spellStart"/>
+      <w:r>
+        <w:t>temp_maxN</w:t>
+      </w:r>
+      <w:proofErr w:type="spellEnd"/>
+      <w:r>
+        <w:t>&gt; - N temperature max value</w:t>
+      </w:r>
+      <w:r>
+        <w:t xml:space="preserve"> (float), 0.00 – 200.00 C</w:t>
       </w:r>
     </w:p>
     <w:p>
@@ -5543,33 +4950,51 @@
       <w:pPr>
         <w:pStyle w:val="20"/>
       </w:pPr>
-      <w:bookmarkStart w:id="19" w:name="_Toc226291983"/>
+      <w:bookmarkStart w:id="17" w:name="_Toc226291983"/>
       <w:r>
         <w:t>Request save configuration</w:t>
       </w:r>
-      <w:bookmarkEnd w:id="19"/>
+      <w:bookmarkEnd w:id="17"/>
     </w:p>
     <w:p>
       <w:pPr>
         <w:pStyle w:val="Requeststyle"/>
-      </w:pPr>
-      <w:r>
+        <w:rPr>
+          <w:highlight w:val="yellow"/>
+        </w:rPr>
+      </w:pPr>
+      <w:r>
+        <w:rPr>
+          <w:highlight w:val="yellow"/>
+        </w:rPr>
         <w:t>"</w:t>
       </w:r>
       <w:proofErr w:type="spellStart"/>
       <w:r>
+        <w:rPr>
+          <w:highlight w:val="yellow"/>
+        </w:rPr>
         <w:t>lssave</w:t>
       </w:r>
       <w:proofErr w:type="spellEnd"/>
       <w:r>
+        <w:rPr>
+          <w:highlight w:val="yellow"/>
+        </w:rPr>
         <w:t xml:space="preserve"> </w:t>
       </w:r>
       <w:proofErr w:type="spellStart"/>
       <w:r>
-        <w:t>usr</w:t>
-      </w:r>
-      <w:proofErr w:type="spellEnd"/>
-      <w:r>
+        <w:rPr>
+          <w:highlight w:val="yellow"/>
+        </w:rPr>
+        <w:t>admn</w:t>
+      </w:r>
+      <w:proofErr w:type="spellEnd"/>
+      <w:r>
+        <w:rPr>
+          <w:highlight w:val="yellow"/>
+        </w:rPr>
         <w:t xml:space="preserve"> &lt;id&gt;\r"</w:t>
       </w:r>
     </w:p>
@@ -5578,11 +5003,13 @@
         <w:spacing w:before="120" w:after="40"/>
         <w:rPr>
           <w:rFonts w:cs="Arial"/>
+          <w:highlight w:val="yellow"/>
         </w:rPr>
       </w:pPr>
       <w:r>
         <w:rPr>
           <w:rFonts w:cs="Arial"/>
+          <w:highlight w:val="yellow"/>
         </w:rPr>
         <w:t>Response:</w:t>
       </w:r>
@@ -5590,26 +5017,44 @@
     <w:p>
       <w:pPr>
         <w:pStyle w:val="Responsestyle"/>
-      </w:pPr>
-      <w:r>
+        <w:rPr>
+          <w:highlight w:val="yellow"/>
+        </w:rPr>
+      </w:pPr>
+      <w:r>
+        <w:rPr>
+          <w:highlight w:val="yellow"/>
+        </w:rPr>
         <w:t>"</w:t>
       </w:r>
       <w:proofErr w:type="spellStart"/>
       <w:proofErr w:type="gramStart"/>
       <w:r>
+        <w:rPr>
+          <w:highlight w:val="yellow"/>
+        </w:rPr>
         <w:t>lrsave</w:t>
       </w:r>
       <w:proofErr w:type="spellEnd"/>
       <w:proofErr w:type="gramEnd"/>
       <w:r>
+        <w:rPr>
+          <w:highlight w:val="yellow"/>
+        </w:rPr>
         <w:t xml:space="preserve"> </w:t>
       </w:r>
       <w:proofErr w:type="spellStart"/>
       <w:r>
-        <w:t>usr</w:t>
-      </w:r>
-      <w:proofErr w:type="spellEnd"/>
-      <w:r>
+        <w:rPr>
+          <w:highlight w:val="yellow"/>
+        </w:rPr>
+        <w:t>admn</w:t>
+      </w:r>
+      <w:proofErr w:type="spellEnd"/>
+      <w:r>
+        <w:rPr>
+          <w:highlight w:val="yellow"/>
+        </w:rPr>
         <w:t xml:space="preserve"> &lt;id&gt; OK\r"</w:t>
       </w:r>
     </w:p>
@@ -5618,11 +5063,13 @@
         <w:spacing w:before="120" w:after="40"/>
         <w:rPr>
           <w:rFonts w:cs="Arial"/>
+          <w:highlight w:val="yellow"/>
         </w:rPr>
       </w:pPr>
       <w:r>
         <w:rPr>
           <w:rFonts w:cs="Arial"/>
+          <w:highlight w:val="yellow"/>
         </w:rPr>
         <w:t>ERROR response:</w:t>
       </w:r>
@@ -5632,24 +5079,39 @@
         <w:pStyle w:val="Responsestyle"/>
       </w:pPr>
       <w:r>
+        <w:rPr>
+          <w:highlight w:val="yellow"/>
+        </w:rPr>
         <w:t>"</w:t>
       </w:r>
       <w:proofErr w:type="spellStart"/>
       <w:proofErr w:type="gramStart"/>
       <w:r>
+        <w:rPr>
+          <w:highlight w:val="yellow"/>
+        </w:rPr>
         <w:t>lrsave</w:t>
       </w:r>
       <w:proofErr w:type="spellEnd"/>
       <w:proofErr w:type="gramEnd"/>
       <w:r>
+        <w:rPr>
+          <w:highlight w:val="yellow"/>
+        </w:rPr>
         <w:t xml:space="preserve"> </w:t>
       </w:r>
       <w:proofErr w:type="spellStart"/>
       <w:r>
-        <w:t>usr</w:t>
-      </w:r>
-      <w:proofErr w:type="spellEnd"/>
-      <w:r>
+        <w:rPr>
+          <w:highlight w:val="yellow"/>
+        </w:rPr>
+        <w:t>admn</w:t>
+      </w:r>
+      <w:proofErr w:type="spellEnd"/>
+      <w:r>
+        <w:rPr>
+          <w:highlight w:val="yellow"/>
+        </w:rPr>
         <w:t xml:space="preserve"> &lt;id&gt; ERR\r"</w:t>
       </w:r>
     </w:p>
@@ -5682,12 +5144,6 @@
         </w:rPr>
         <w:t>&lt;id&gt; - device id (int), 0 if device is single</w:t>
       </w:r>
-    </w:p>
-    <w:p>
-      <w:pPr>
-        <w:pStyle w:val="Responsestyle"/>
-        <w:ind w:firstLine="567"/>
-      </w:pPr>
     </w:p>
     <w:sectPr>
       <w:pgSz w:w="11906" w:h="16838"/>
@@ -8335,7 +7791,6 @@
     <w:lvl w:ilvl="0" w:tplc="49E664E6">
       <w:start w:val="1"/>
       <w:numFmt w:val="bullet"/>
-      <w:pStyle w:val="10"/>
       <w:lvlText w:val=""/>
       <w:lvlJc w:val="left"/>
       <w:pPr>

</xml_diff>

<commit_message>
added divider for pocels pulses
</commit_message>
<xml_diff>
--- a/docs/Protocol_EVO_SSL_670_5.docx
+++ b/docs/Protocol_EVO_SSL_670_5.docx
@@ -30,7 +30,7 @@
         <w:br w:type="page"/>
       </w:r>
     </w:p>
-    <w:bookmarkStart w:id="0" w:name="_Toc226291964" w:displacedByCustomXml="next"/>
+    <w:bookmarkStart w:id="0" w:name="_Toc226801175" w:displacedByCustomXml="next"/>
     <w:sdt>
       <w:sdtPr>
         <w:rPr>
@@ -89,7 +89,7 @@
           <w:r>
             <w:fldChar w:fldCharType="separate"/>
           </w:r>
-          <w:hyperlink w:anchor="_Toc226291964" w:history="1">
+          <w:hyperlink w:anchor="_Toc226801175" w:history="1">
             <w:r>
               <w:rPr>
                 <w:rStyle w:val="a6"/>
@@ -133,7 +133,7 @@
                 <w:noProof/>
                 <w:webHidden/>
               </w:rPr>
-              <w:instrText xml:space="preserve"> PAGEREF _Toc226291964 \h </w:instrText>
+              <w:instrText xml:space="preserve"> PAGEREF _Toc226801175 \h </w:instrText>
             </w:r>
             <w:r>
               <w:rPr>
@@ -178,7 +178,7 @@
               <w:lang w:val="ru-RU" w:eastAsia="ru-RU"/>
             </w:rPr>
           </w:pPr>
-          <w:hyperlink w:anchor="_Toc226291965" w:history="1">
+          <w:hyperlink w:anchor="_Toc226801176" w:history="1">
             <w:r>
               <w:rPr>
                 <w:rStyle w:val="a6"/>
@@ -221,7 +221,7 @@
                 <w:noProof/>
                 <w:webHidden/>
               </w:rPr>
-              <w:instrText xml:space="preserve"> PAGEREF _Toc226291965 \h </w:instrText>
+              <w:instrText xml:space="preserve"> PAGEREF _Toc226801176 \h </w:instrText>
             </w:r>
             <w:r>
               <w:rPr>
@@ -266,7 +266,7 @@
               <w:lang w:val="ru-RU" w:eastAsia="ru-RU"/>
             </w:rPr>
           </w:pPr>
-          <w:hyperlink w:anchor="_Toc226291966" w:history="1">
+          <w:hyperlink w:anchor="_Toc226801177" w:history="1">
             <w:r>
               <w:rPr>
                 <w:rStyle w:val="a6"/>
@@ -309,7 +309,7 @@
                 <w:noProof/>
                 <w:webHidden/>
               </w:rPr>
-              <w:instrText xml:space="preserve"> PAGEREF _Toc226291966 \h </w:instrText>
+              <w:instrText xml:space="preserve"> PAGEREF _Toc226801177 \h </w:instrText>
             </w:r>
             <w:r>
               <w:rPr>
@@ -354,7 +354,7 @@
               <w:lang w:val="ru-RU" w:eastAsia="ru-RU"/>
             </w:rPr>
           </w:pPr>
-          <w:hyperlink w:anchor="_Toc226291967" w:history="1">
+          <w:hyperlink w:anchor="_Toc226801178" w:history="1">
             <w:r>
               <w:rPr>
                 <w:rStyle w:val="a6"/>
@@ -397,7 +397,7 @@
                 <w:noProof/>
                 <w:webHidden/>
               </w:rPr>
-              <w:instrText xml:space="preserve"> PAGEREF _Toc226291967 \h </w:instrText>
+              <w:instrText xml:space="preserve"> PAGEREF _Toc226801178 \h </w:instrText>
             </w:r>
             <w:r>
               <w:rPr>
@@ -442,7 +442,7 @@
               <w:lang w:val="ru-RU" w:eastAsia="ru-RU"/>
             </w:rPr>
           </w:pPr>
-          <w:hyperlink w:anchor="_Toc226291968" w:history="1">
+          <w:hyperlink w:anchor="_Toc226801179" w:history="1">
             <w:r>
               <w:rPr>
                 <w:rStyle w:val="a6"/>
@@ -485,7 +485,7 @@
                 <w:noProof/>
                 <w:webHidden/>
               </w:rPr>
-              <w:instrText xml:space="preserve"> PAGEREF _Toc226291968 \h </w:instrText>
+              <w:instrText xml:space="preserve"> PAGEREF _Toc226801179 \h </w:instrText>
             </w:r>
             <w:r>
               <w:rPr>
@@ -530,7 +530,7 @@
               <w:lang w:val="ru-RU" w:eastAsia="ru-RU"/>
             </w:rPr>
           </w:pPr>
-          <w:hyperlink w:anchor="_Toc226291969" w:history="1">
+          <w:hyperlink w:anchor="_Toc226801180" w:history="1">
             <w:r>
               <w:rPr>
                 <w:rStyle w:val="a6"/>
@@ -573,7 +573,7 @@
                 <w:noProof/>
                 <w:webHidden/>
               </w:rPr>
-              <w:instrText xml:space="preserve"> PAGEREF _Toc226291969 \h </w:instrText>
+              <w:instrText xml:space="preserve"> PAGEREF _Toc226801180 \h </w:instrText>
             </w:r>
             <w:r>
               <w:rPr>
@@ -618,7 +618,7 @@
               <w:lang w:val="ru-RU" w:eastAsia="ru-RU"/>
             </w:rPr>
           </w:pPr>
-          <w:hyperlink w:anchor="_Toc226291970" w:history="1">
+          <w:hyperlink w:anchor="_Toc226801181" w:history="1">
             <w:r>
               <w:rPr>
                 <w:rStyle w:val="a6"/>
@@ -661,7 +661,7 @@
                 <w:noProof/>
                 <w:webHidden/>
               </w:rPr>
-              <w:instrText xml:space="preserve"> PAGEREF _Toc226291970 \h </w:instrText>
+              <w:instrText xml:space="preserve"> PAGEREF _Toc226801181 \h </w:instrText>
             </w:r>
             <w:r>
               <w:rPr>
@@ -706,7 +706,7 @@
               <w:lang w:val="ru-RU" w:eastAsia="ru-RU"/>
             </w:rPr>
           </w:pPr>
-          <w:hyperlink w:anchor="_Toc226291971" w:history="1">
+          <w:hyperlink w:anchor="_Toc226801182" w:history="1">
             <w:r>
               <w:rPr>
                 <w:rStyle w:val="a6"/>
@@ -749,7 +749,7 @@
                 <w:noProof/>
                 <w:webHidden/>
               </w:rPr>
-              <w:instrText xml:space="preserve"> PAGEREF _Toc226291971 \h </w:instrText>
+              <w:instrText xml:space="preserve"> PAGEREF _Toc226801182 \h </w:instrText>
             </w:r>
             <w:r>
               <w:rPr>
@@ -794,7 +794,7 @@
               <w:lang w:val="ru-RU" w:eastAsia="ru-RU"/>
             </w:rPr>
           </w:pPr>
-          <w:hyperlink w:anchor="_Toc226291972" w:history="1">
+          <w:hyperlink w:anchor="_Toc226801183" w:history="1">
             <w:r>
               <w:rPr>
                 <w:rStyle w:val="a6"/>
@@ -837,7 +837,7 @@
                 <w:noProof/>
                 <w:webHidden/>
               </w:rPr>
-              <w:instrText xml:space="preserve"> PAGEREF _Toc226291972 \h </w:instrText>
+              <w:instrText xml:space="preserve"> PAGEREF _Toc226801183 \h </w:instrText>
             </w:r>
             <w:r>
               <w:rPr>
@@ -882,7 +882,7 @@
               <w:lang w:val="ru-RU" w:eastAsia="ru-RU"/>
             </w:rPr>
           </w:pPr>
-          <w:hyperlink w:anchor="_Toc226291973" w:history="1">
+          <w:hyperlink w:anchor="_Toc226801184" w:history="1">
             <w:r>
               <w:rPr>
                 <w:rStyle w:val="a6"/>
@@ -925,7 +925,7 @@
                 <w:noProof/>
                 <w:webHidden/>
               </w:rPr>
-              <w:instrText xml:space="preserve"> PAGEREF _Toc226291973 \h </w:instrText>
+              <w:instrText xml:space="preserve"> PAGEREF _Toc226801184 \h </w:instrText>
             </w:r>
             <w:r>
               <w:rPr>
@@ -970,12 +970,12 @@
               <w:lang w:val="ru-RU" w:eastAsia="ru-RU"/>
             </w:rPr>
           </w:pPr>
-          <w:hyperlink w:anchor="_Toc226291974" w:history="1">
+          <w:hyperlink w:anchor="_Toc226801185" w:history="1">
             <w:r>
               <w:rPr>
                 <w:rStyle w:val="a6"/>
                 <w:noProof/>
-                <w:highlight w:val="black"/>
+                <w:highlight w:val="yellow"/>
               </w:rPr>
               <w:t>5.2.</w:t>
             </w:r>
@@ -992,9 +992,9 @@
               <w:rPr>
                 <w:rStyle w:val="a6"/>
                 <w:noProof/>
-                <w:highlight w:val="black"/>
-              </w:rPr>
-              <w:t>Request to set mode</w:t>
+                <w:highlight w:val="yellow"/>
+              </w:rPr>
+              <w:t>Request to set emission on/off state</w:t>
             </w:r>
             <w:r>
               <w:rPr>
@@ -1015,7 +1015,7 @@
                 <w:noProof/>
                 <w:webHidden/>
               </w:rPr>
-              <w:instrText xml:space="preserve"> PAGEREF _Toc226291974 \h </w:instrText>
+              <w:instrText xml:space="preserve"> PAGEREF _Toc226801185 \h </w:instrText>
             </w:r>
             <w:r>
               <w:rPr>
@@ -1060,12 +1060,11 @@
               <w:lang w:val="ru-RU" w:eastAsia="ru-RU"/>
             </w:rPr>
           </w:pPr>
-          <w:hyperlink w:anchor="_Toc226291975" w:history="1">
+          <w:hyperlink w:anchor="_Toc226801186" w:history="1">
             <w:r>
               <w:rPr>
                 <w:rStyle w:val="a6"/>
                 <w:noProof/>
-                <w:highlight w:val="black"/>
               </w:rPr>
               <w:t>5.3.</w:t>
             </w:r>
@@ -1082,9 +1081,8 @@
               <w:rPr>
                 <w:rStyle w:val="a6"/>
                 <w:noProof/>
-                <w:highlight w:val="black"/>
-              </w:rPr>
-              <w:t>Request to set on/off emission</w:t>
+              </w:rPr>
+              <w:t>Request to set mode</w:t>
             </w:r>
             <w:r>
               <w:rPr>
@@ -1105,7 +1103,7 @@
                 <w:noProof/>
                 <w:webHidden/>
               </w:rPr>
-              <w:instrText xml:space="preserve"> PAGEREF _Toc226291975 \h </w:instrText>
+              <w:instrText xml:space="preserve"> PAGEREF _Toc226801186 \h </w:instrText>
             </w:r>
             <w:r>
               <w:rPr>
@@ -1125,7 +1123,7 @@
                 <w:noProof/>
                 <w:webHidden/>
               </w:rPr>
-              <w:t>6</w:t>
+              <w:t>5</w:t>
             </w:r>
             <w:r>
               <w:rPr>
@@ -1150,12 +1148,12 @@
               <w:lang w:val="ru-RU" w:eastAsia="ru-RU"/>
             </w:rPr>
           </w:pPr>
-          <w:hyperlink w:anchor="_Toc226291976" w:history="1">
+          <w:hyperlink w:anchor="_Toc226801187" w:history="1">
             <w:r>
               <w:rPr>
                 <w:rStyle w:val="a6"/>
                 <w:noProof/>
-                <w:highlight w:val="black"/>
+                <w:highlight w:val="yellow"/>
               </w:rPr>
               <w:t>5.4.</w:t>
             </w:r>
@@ -1172,9 +1170,9 @@
               <w:rPr>
                 <w:rStyle w:val="a6"/>
                 <w:noProof/>
-                <w:highlight w:val="black"/>
-              </w:rPr>
-              <w:t>Request to set seed pulse’s frequency</w:t>
+                <w:highlight w:val="yellow"/>
+              </w:rPr>
+              <w:t>Request to set mode</w:t>
             </w:r>
             <w:r>
               <w:rPr>
@@ -1195,7 +1193,7 @@
                 <w:noProof/>
                 <w:webHidden/>
               </w:rPr>
-              <w:instrText xml:space="preserve"> PAGEREF _Toc226291976 \h </w:instrText>
+              <w:instrText xml:space="preserve"> PAGEREF _Toc226801187 \h </w:instrText>
             </w:r>
             <w:r>
               <w:rPr>
@@ -1240,12 +1238,11 @@
               <w:lang w:val="ru-RU" w:eastAsia="ru-RU"/>
             </w:rPr>
           </w:pPr>
-          <w:hyperlink w:anchor="_Toc226291977" w:history="1">
+          <w:hyperlink w:anchor="_Toc226801188" w:history="1">
             <w:r>
               <w:rPr>
                 <w:rStyle w:val="a6"/>
                 <w:noProof/>
-                <w:highlight w:val="black"/>
               </w:rPr>
               <w:t>5.5.</w:t>
             </w:r>
@@ -1262,9 +1259,8 @@
               <w:rPr>
                 <w:rStyle w:val="a6"/>
                 <w:noProof/>
-                <w:highlight w:val="black"/>
-              </w:rPr>
-              <w:t>Request to set gate mode</w:t>
+              </w:rPr>
+              <w:t>Request to set PSU permission</w:t>
             </w:r>
             <w:r>
               <w:rPr>
@@ -1285,7 +1281,7 @@
                 <w:noProof/>
                 <w:webHidden/>
               </w:rPr>
-              <w:instrText xml:space="preserve"> PAGEREF _Toc226291977 \h </w:instrText>
+              <w:instrText xml:space="preserve"> PAGEREF _Toc226801188 \h </w:instrText>
             </w:r>
             <w:r>
               <w:rPr>
@@ -1330,12 +1326,11 @@
               <w:lang w:val="ru-RU" w:eastAsia="ru-RU"/>
             </w:rPr>
           </w:pPr>
-          <w:hyperlink w:anchor="_Toc226291978" w:history="1">
+          <w:hyperlink w:anchor="_Toc226801189" w:history="1">
             <w:r>
               <w:rPr>
                 <w:rStyle w:val="a6"/>
                 <w:noProof/>
-                <w:highlight w:val="black"/>
               </w:rPr>
               <w:t>5.6.</w:t>
             </w:r>
@@ -1352,9 +1347,8 @@
               <w:rPr>
                 <w:rStyle w:val="a6"/>
                 <w:noProof/>
-                <w:highlight w:val="black"/>
-              </w:rPr>
-              <w:t>Request set output power</w:t>
+              </w:rPr>
+              <w:t>Request to clear errors</w:t>
             </w:r>
             <w:r>
               <w:rPr>
@@ -1375,7 +1369,7 @@
                 <w:noProof/>
                 <w:webHidden/>
               </w:rPr>
-              <w:instrText xml:space="preserve"> PAGEREF _Toc226291978 \h </w:instrText>
+              <w:instrText xml:space="preserve"> PAGEREF _Toc226801189 \h </w:instrText>
             </w:r>
             <w:r>
               <w:rPr>
@@ -1395,7 +1389,7 @@
                 <w:noProof/>
                 <w:webHidden/>
               </w:rPr>
-              <w:t>7</w:t>
+              <w:t>6</w:t>
             </w:r>
             <w:r>
               <w:rPr>
@@ -1420,12 +1414,11 @@
               <w:lang w:val="ru-RU" w:eastAsia="ru-RU"/>
             </w:rPr>
           </w:pPr>
-          <w:hyperlink w:anchor="_Toc226291979" w:history="1">
+          <w:hyperlink w:anchor="_Toc226801190" w:history="1">
             <w:r>
               <w:rPr>
                 <w:rStyle w:val="a6"/>
                 <w:noProof/>
-                <w:highlight w:val="black"/>
               </w:rPr>
               <w:t>5.7.</w:t>
             </w:r>
@@ -1442,7 +1435,94 @@
               <w:rPr>
                 <w:rStyle w:val="a6"/>
                 <w:noProof/>
-                <w:highlight w:val="black"/>
+              </w:rPr>
+              <w:t>Request to set quantron pulse frequency</w:t>
+            </w:r>
+            <w:r>
+              <w:rPr>
+                <w:noProof/>
+                <w:webHidden/>
+              </w:rPr>
+              <w:tab/>
+            </w:r>
+            <w:r>
+              <w:rPr>
+                <w:noProof/>
+                <w:webHidden/>
+              </w:rPr>
+              <w:fldChar w:fldCharType="begin"/>
+            </w:r>
+            <w:r>
+              <w:rPr>
+                <w:noProof/>
+                <w:webHidden/>
+              </w:rPr>
+              <w:instrText xml:space="preserve"> PAGEREF _Toc226801190 \h </w:instrText>
+            </w:r>
+            <w:r>
+              <w:rPr>
+                <w:noProof/>
+                <w:webHidden/>
+              </w:rPr>
+            </w:r>
+            <w:r>
+              <w:rPr>
+                <w:noProof/>
+                <w:webHidden/>
+              </w:rPr>
+              <w:fldChar w:fldCharType="separate"/>
+            </w:r>
+            <w:r>
+              <w:rPr>
+                <w:noProof/>
+                <w:webHidden/>
+              </w:rPr>
+              <w:t>7</w:t>
+            </w:r>
+            <w:r>
+              <w:rPr>
+                <w:noProof/>
+                <w:webHidden/>
+              </w:rPr>
+              <w:fldChar w:fldCharType="end"/>
+            </w:r>
+          </w:hyperlink>
+        </w:p>
+        <w:p>
+          <w:pPr>
+            <w:pStyle w:val="22"/>
+            <w:tabs>
+              <w:tab w:val="left" w:pos="1540"/>
+              <w:tab w:val="right" w:leader="dot" w:pos="9345"/>
+            </w:tabs>
+            <w:rPr>
+              <w:rFonts w:asciiTheme="minorHAnsi" w:eastAsiaTheme="minorEastAsia" w:hAnsiTheme="minorHAnsi"/>
+              <w:noProof/>
+              <w:sz w:val="22"/>
+              <w:lang w:val="ru-RU" w:eastAsia="ru-RU"/>
+            </w:rPr>
+          </w:pPr>
+          <w:hyperlink w:anchor="_Toc226801191" w:history="1">
+            <w:r>
+              <w:rPr>
+                <w:rStyle w:val="a6"/>
+                <w:noProof/>
+              </w:rPr>
+              <w:t>5.8.</w:t>
+            </w:r>
+            <w:r>
+              <w:rPr>
+                <w:rFonts w:asciiTheme="minorHAnsi" w:eastAsiaTheme="minorEastAsia" w:hAnsiTheme="minorHAnsi"/>
+                <w:noProof/>
+                <w:sz w:val="22"/>
+                <w:lang w:val="ru-RU" w:eastAsia="ru-RU"/>
+              </w:rPr>
+              <w:tab/>
+            </w:r>
+            <w:r>
+              <w:rPr>
+                <w:rStyle w:val="a6"/>
+                <w:noProof/>
               </w:rPr>
               <w:t xml:space="preserve">Request set </w:t>
             </w:r>
@@ -1450,7 +1530,6 @@
               <w:rPr>
                 <w:rStyle w:val="a6"/>
                 <w:noProof/>
-                <w:highlight w:val="black"/>
                 <w:lang w:val="fr-FR"/>
               </w:rPr>
               <w:t>pulse dur</w:t>
@@ -1459,7 +1538,6 @@
               <w:rPr>
                 <w:rStyle w:val="a6"/>
                 <w:noProof/>
-                <w:highlight w:val="black"/>
               </w:rPr>
               <w:t>ation</w:t>
             </w:r>
@@ -1482,7 +1560,7 @@
                 <w:noProof/>
                 <w:webHidden/>
               </w:rPr>
-              <w:instrText xml:space="preserve"> PAGEREF _Toc226291979 \h </w:instrText>
+              <w:instrText xml:space="preserve"> PAGEREF _Toc226801191 \h </w:instrText>
             </w:r>
             <w:r>
               <w:rPr>
@@ -1527,7 +1605,7 @@
               <w:lang w:val="ru-RU" w:eastAsia="ru-RU"/>
             </w:rPr>
           </w:pPr>
-          <w:hyperlink w:anchor="_Toc226291980" w:history="1">
+          <w:hyperlink w:anchor="_Toc226801192" w:history="1">
             <w:r>
               <w:rPr>
                 <w:rStyle w:val="a6"/>
@@ -1570,7 +1648,7 @@
                 <w:noProof/>
                 <w:webHidden/>
               </w:rPr>
-              <w:instrText xml:space="preserve"> PAGEREF _Toc226291980 \h </w:instrText>
+              <w:instrText xml:space="preserve"> PAGEREF _Toc226801192 \h </w:instrText>
             </w:r>
             <w:r>
               <w:rPr>
@@ -1590,7 +1668,7 @@
                 <w:noProof/>
                 <w:webHidden/>
               </w:rPr>
-              <w:t>7</w:t>
+              <w:t>8</w:t>
             </w:r>
             <w:r>
               <w:rPr>
@@ -1615,7 +1693,7 @@
               <w:lang w:val="ru-RU" w:eastAsia="ru-RU"/>
             </w:rPr>
           </w:pPr>
-          <w:hyperlink w:anchor="_Toc226291981" w:history="1">
+          <w:hyperlink w:anchor="_Toc226801193" w:history="1">
             <w:r>
               <w:rPr>
                 <w:rStyle w:val="a6"/>
@@ -1637,7 +1715,7 @@
                 <w:rStyle w:val="a6"/>
                 <w:noProof/>
               </w:rPr>
-              <w:t>Request set configuration</w:t>
+              <w:t>Status request</w:t>
             </w:r>
             <w:r>
               <w:rPr>
@@ -1658,7 +1736,7 @@
                 <w:noProof/>
                 <w:webHidden/>
               </w:rPr>
-              <w:instrText xml:space="preserve"> PAGEREF _Toc226291981 \h </w:instrText>
+              <w:instrText xml:space="preserve"> PAGEREF _Toc226801193 \h </w:instrText>
             </w:r>
             <w:r>
               <w:rPr>
@@ -1678,7 +1756,7 @@
                 <w:noProof/>
                 <w:webHidden/>
               </w:rPr>
-              <w:t>7</w:t>
+              <w:t>8</w:t>
             </w:r>
             <w:r>
               <w:rPr>
@@ -1703,7 +1781,7 @@
               <w:lang w:val="ru-RU" w:eastAsia="ru-RU"/>
             </w:rPr>
           </w:pPr>
-          <w:hyperlink w:anchor="_Toc226291982" w:history="1">
+          <w:hyperlink w:anchor="_Toc226801194" w:history="1">
             <w:r>
               <w:rPr>
                 <w:rStyle w:val="a6"/>
@@ -1725,7 +1803,7 @@
                 <w:rStyle w:val="a6"/>
                 <w:noProof/>
               </w:rPr>
-              <w:t>Request get configuration</w:t>
+              <w:t>Request set configuration</w:t>
             </w:r>
             <w:r>
               <w:rPr>
@@ -1746,7 +1824,7 @@
                 <w:noProof/>
                 <w:webHidden/>
               </w:rPr>
-              <w:instrText xml:space="preserve"> PAGEREF _Toc226291982 \h </w:instrText>
+              <w:instrText xml:space="preserve"> PAGEREF _Toc226801194 \h </w:instrText>
             </w:r>
             <w:r>
               <w:rPr>
@@ -1791,7 +1869,7 @@
               <w:lang w:val="ru-RU" w:eastAsia="ru-RU"/>
             </w:rPr>
           </w:pPr>
-          <w:hyperlink w:anchor="_Toc226291983" w:history="1">
+          <w:hyperlink w:anchor="_Toc226801195" w:history="1">
             <w:r>
               <w:rPr>
                 <w:rStyle w:val="a6"/>
@@ -1813,7 +1891,7 @@
                 <w:rStyle w:val="a6"/>
                 <w:noProof/>
               </w:rPr>
-              <w:t>Request save configuration</w:t>
+              <w:t>Request get configuration</w:t>
             </w:r>
             <w:r>
               <w:rPr>
@@ -1834,7 +1912,7 @@
                 <w:noProof/>
                 <w:webHidden/>
               </w:rPr>
-              <w:instrText xml:space="preserve"> PAGEREF _Toc226291983 \h </w:instrText>
+              <w:instrText xml:space="preserve"> PAGEREF _Toc226801195 \h </w:instrText>
             </w:r>
             <w:r>
               <w:rPr>
@@ -1867,9 +1945,9 @@
         </w:p>
         <w:p>
           <w:pPr>
-            <w:pStyle w:val="11"/>
+            <w:pStyle w:val="22"/>
             <w:tabs>
-              <w:tab w:val="left" w:pos="1100"/>
+              <w:tab w:val="left" w:pos="1540"/>
               <w:tab w:val="right" w:leader="dot" w:pos="9345"/>
             </w:tabs>
             <w:rPr>
@@ -1879,13 +1957,13 @@
               <w:lang w:val="ru-RU" w:eastAsia="ru-RU"/>
             </w:rPr>
           </w:pPr>
-          <w:hyperlink w:anchor="_Toc226291984" w:history="1">
+          <w:hyperlink w:anchor="_Toc226801196" w:history="1">
             <w:r>
               <w:rPr>
                 <w:rStyle w:val="a6"/>
                 <w:noProof/>
               </w:rPr>
-              <w:t>7.</w:t>
+              <w:t>6.4.</w:t>
             </w:r>
             <w:r>
               <w:rPr>
@@ -1901,7 +1979,7 @@
                 <w:rStyle w:val="a6"/>
                 <w:noProof/>
               </w:rPr>
-              <w:t>Example</w:t>
+              <w:t>Request save configuration</w:t>
             </w:r>
             <w:r>
               <w:rPr>
@@ -1922,7 +2000,7 @@
                 <w:noProof/>
                 <w:webHidden/>
               </w:rPr>
-              <w:instrText xml:space="preserve"> PAGEREF _Toc226291984 \h </w:instrText>
+              <w:instrText xml:space="preserve"> PAGEREF _Toc226801196 \h </w:instrText>
             </w:r>
             <w:r>
               <w:rPr>
@@ -1942,7 +2020,7 @@
                 <w:noProof/>
                 <w:webHidden/>
               </w:rPr>
-              <w:t>8</w:t>
+              <w:t>9</w:t>
             </w:r>
             <w:r>
               <w:rPr>
@@ -1977,7 +2055,7 @@
       <w:pPr>
         <w:pStyle w:val="1"/>
       </w:pPr>
-      <w:bookmarkStart w:id="1" w:name="_Toc226291965"/>
+      <w:bookmarkStart w:id="1" w:name="_Toc226801176"/>
       <w:r>
         <w:lastRenderedPageBreak/>
         <w:t>Description of the UKKO_NS_1064_Interface_board protocol</w:t>
@@ -2105,7 +2183,7 @@
       <w:pPr>
         <w:pStyle w:val="1"/>
       </w:pPr>
-      <w:bookmarkStart w:id="2" w:name="_Toc226291966"/>
+      <w:bookmarkStart w:id="2" w:name="_Toc226801177"/>
       <w:r>
         <w:t>Command format:</w:t>
       </w:r>
@@ -2274,7 +2352,7 @@
       <w:pPr>
         <w:pStyle w:val="1"/>
       </w:pPr>
-      <w:bookmarkStart w:id="3" w:name="_Toc226291967"/>
+      <w:bookmarkStart w:id="3" w:name="_Toc226801178"/>
       <w:r>
         <w:lastRenderedPageBreak/>
         <w:t>Common commands</w:t>
@@ -2308,7 +2386,7 @@
       <w:pPr>
         <w:pStyle w:val="20"/>
       </w:pPr>
-      <w:bookmarkStart w:id="4" w:name="_Toc226291968"/>
+      <w:bookmarkStart w:id="4" w:name="_Toc226801179"/>
       <w:r>
         <w:t>Get protocol version</w:t>
       </w:r>
@@ -2373,7 +2451,7 @@
       <w:pPr>
         <w:pStyle w:val="20"/>
       </w:pPr>
-      <w:bookmarkStart w:id="5" w:name="_Toc226291969"/>
+      <w:bookmarkStart w:id="5" w:name="_Toc226801180"/>
       <w:r>
         <w:t>Get hash</w:t>
       </w:r>
@@ -2442,7 +2520,7 @@
       <w:pPr>
         <w:pStyle w:val="20"/>
       </w:pPr>
-      <w:bookmarkStart w:id="6" w:name="_Toc226291970"/>
+      <w:bookmarkStart w:id="6" w:name="_Toc226801181"/>
       <w:r>
         <w:t>Factory reset request</w:t>
       </w:r>
@@ -2497,7 +2575,6 @@
         <w:t>“</w:t>
       </w:r>
       <w:proofErr w:type="spellStart"/>
-      <w:proofErr w:type="gramStart"/>
       <w:r>
         <w:rPr>
           <w:rStyle w:val="Responsestyle0"/>
@@ -2505,7 +2582,6 @@
         <w:t>lrfactrst</w:t>
       </w:r>
       <w:proofErr w:type="spellEnd"/>
-      <w:proofErr w:type="gramEnd"/>
       <w:r>
         <w:t xml:space="preserve"> OK\r”</w:t>
       </w:r>
@@ -2531,12 +2607,10 @@
         <w:t>“</w:t>
       </w:r>
       <w:proofErr w:type="spellStart"/>
-      <w:proofErr w:type="gramStart"/>
       <w:r>
         <w:t>lrfactrst</w:t>
       </w:r>
       <w:proofErr w:type="spellEnd"/>
-      <w:proofErr w:type="gramEnd"/>
       <w:r>
         <w:t xml:space="preserve"> ERR\r” </w:t>
       </w:r>
@@ -2552,7 +2626,7 @@
       <w:pPr>
         <w:pStyle w:val="20"/>
       </w:pPr>
-      <w:bookmarkStart w:id="7" w:name="_Toc226291971"/>
+      <w:bookmarkStart w:id="7" w:name="_Toc226801182"/>
       <w:r>
         <w:t xml:space="preserve">Switch to </w:t>
       </w:r>
@@ -2616,7 +2690,6 @@
         <w:t>“</w:t>
       </w:r>
       <w:proofErr w:type="spellStart"/>
-      <w:proofErr w:type="gramStart"/>
       <w:r>
         <w:rPr>
           <w:rStyle w:val="Responsestyle0"/>
@@ -2636,7 +2709,6 @@
         <w:t>bootloader</w:t>
       </w:r>
       <w:proofErr w:type="spellEnd"/>
-      <w:proofErr w:type="gramEnd"/>
       <w:r>
         <w:t xml:space="preserve"> O</w:t>
       </w:r>
@@ -2685,7 +2757,7 @@
       <w:pPr>
         <w:pStyle w:val="1"/>
       </w:pPr>
-      <w:bookmarkStart w:id="8" w:name="_Toc226291972"/>
+      <w:bookmarkStart w:id="8" w:name="_Toc226801183"/>
       <w:r>
         <w:lastRenderedPageBreak/>
         <w:t>User commands</w:t>
@@ -2696,7 +2768,7 @@
       <w:pPr>
         <w:pStyle w:val="20"/>
       </w:pPr>
-      <w:bookmarkStart w:id="9" w:name="_Toc226291973"/>
+      <w:bookmarkStart w:id="9" w:name="_Toc226801184"/>
       <w:r>
         <w:t>Request to get status</w:t>
       </w:r>
@@ -2710,12 +2782,10 @@
         <w:t>"</w:t>
       </w:r>
       <w:proofErr w:type="spellStart"/>
-      <w:proofErr w:type="gramStart"/>
       <w:r>
         <w:t>lgstatus</w:t>
       </w:r>
       <w:proofErr w:type="spellEnd"/>
-      <w:proofErr w:type="gramEnd"/>
       <w:r>
         <w:t xml:space="preserve"> </w:t>
       </w:r>
@@ -2747,12 +2817,10 @@
         <w:t>"</w:t>
       </w:r>
       <w:proofErr w:type="spellStart"/>
-      <w:proofErr w:type="gramStart"/>
       <w:r>
         <w:t>lrstatus</w:t>
       </w:r>
       <w:proofErr w:type="spellEnd"/>
-      <w:proofErr w:type="gramEnd"/>
       <w:r>
         <w:t xml:space="preserve"> </w:t>
       </w:r>
@@ -2785,71 +2853,85 @@
         <w:t>&gt;</w:t>
       </w:r>
       <w:r>
+        <w:t xml:space="preserve"> &lt;overheat&gt;</w:t>
+      </w:r>
+      <w:r>
+        <w:t xml:space="preserve"> &lt;</w:t>
+      </w:r>
+      <w:proofErr w:type="spellStart"/>
+      <w:r>
+        <w:t>seed_state</w:t>
+      </w:r>
+      <w:proofErr w:type="spellEnd"/>
+      <w:r>
+        <w:t>&gt; &lt;</w:t>
+      </w:r>
+      <w:proofErr w:type="spellStart"/>
+      <w:r>
+        <w:t>PS</w:t>
+      </w:r>
+      <w:r>
+        <w:t>U</w:t>
+      </w:r>
+      <w:r>
+        <w:t>_</w:t>
+      </w:r>
+      <w:r>
+        <w:t>permission</w:t>
+      </w:r>
+      <w:proofErr w:type="spellEnd"/>
+      <w:r>
+        <w:t>&gt; &lt;</w:t>
+      </w:r>
+      <w:proofErr w:type="spellStart"/>
+      <w:r>
+        <w:t>PS</w:t>
+      </w:r>
+      <w:r>
+        <w:t>U</w:t>
+      </w:r>
+      <w:r>
+        <w:t>_state</w:t>
+      </w:r>
+      <w:proofErr w:type="spellEnd"/>
+      <w:r>
+        <w:t>&gt;</w:t>
+      </w:r>
+      <w:r>
+        <w:t xml:space="preserve"> &lt;</w:t>
+      </w:r>
+      <w:proofErr w:type="spellStart"/>
+      <w:r>
+        <w:t>quant_mode</w:t>
+      </w:r>
+      <w:proofErr w:type="spellEnd"/>
+      <w:r>
+        <w:t>&gt;</w:t>
+      </w:r>
+      <w:r>
         <w:t xml:space="preserve"> </w:t>
       </w:r>
       <w:r>
         <w:rPr>
           <w:highlight w:val="yellow"/>
         </w:rPr>
-        <w:t>&lt;overheat&gt;</w:t>
-      </w:r>
-      <w:r>
-        <w:t xml:space="preserve"> &lt;</w:t>
-      </w:r>
-      <w:proofErr w:type="spellStart"/>
-      <w:r>
-        <w:t>seed_state</w:t>
-      </w:r>
-      <w:proofErr w:type="spellEnd"/>
-      <w:r>
-        <w:t>&gt; &lt;</w:t>
-      </w:r>
-      <w:proofErr w:type="spellStart"/>
-      <w:r>
-        <w:t>PS</w:t>
-      </w:r>
-      <w:r>
-        <w:t>U</w:t>
-      </w:r>
-      <w:r>
-        <w:t>_</w:t>
-      </w:r>
-      <w:r>
-        <w:t>permission</w:t>
-      </w:r>
-      <w:proofErr w:type="spellEnd"/>
-      <w:r>
-        <w:t>&gt; &lt;</w:t>
-      </w:r>
-      <w:proofErr w:type="spellStart"/>
-      <w:r>
-        <w:t>PS</w:t>
-      </w:r>
-      <w:r>
-        <w:t>U</w:t>
-      </w:r>
-      <w:r>
-        <w:t>_state</w:t>
-      </w:r>
-      <w:proofErr w:type="spellEnd"/>
-      <w:r>
+        <w:t>&lt;</w:t>
+      </w:r>
+      <w:proofErr w:type="spellStart"/>
+      <w:r>
+        <w:rPr>
+          <w:highlight w:val="yellow"/>
+        </w:rPr>
+        <w:t>pocels_div</w:t>
+      </w:r>
+      <w:proofErr w:type="spellEnd"/>
+      <w:r>
+        <w:rPr>
+          <w:highlight w:val="yellow"/>
+        </w:rPr>
         <w:t>&gt;</w:t>
       </w:r>
       <w:r>
-        <w:t xml:space="preserve"> </w:t>
-      </w:r>
-      <w:r>
-        <w:t>&lt;</w:t>
-      </w:r>
-      <w:proofErr w:type="spellStart"/>
-      <w:r>
-        <w:t>quant_mode</w:t>
-      </w:r>
-      <w:proofErr w:type="spellEnd"/>
-      <w:r>
-        <w:t>&gt;</w:t>
-      </w:r>
-      <w:r>
         <w:t>\r\n"</w:t>
       </w:r>
     </w:p>
@@ -2867,12 +2949,10 @@
         <w:t>“</w:t>
       </w:r>
       <w:proofErr w:type="spellStart"/>
-      <w:proofErr w:type="gramStart"/>
       <w:r>
         <w:t>lrstatus</w:t>
       </w:r>
       <w:proofErr w:type="spellEnd"/>
-      <w:proofErr w:type="gramEnd"/>
       <w:r>
         <w:t xml:space="preserve"> </w:t>
       </w:r>
@@ -2921,10 +3001,7 @@
         </w:rPr>
       </w:pPr>
       <w:r>
-        <w:t xml:space="preserve">&lt;keylock&gt; </w:t>
-      </w:r>
-      <w:r>
-        <w:t>- key lock state (int), 0 – ok, 1 – alarm</w:t>
+        <w:t>&lt;keylock&gt; - key lock state (int), 0 – ok, 1 – alarm</w:t>
       </w:r>
     </w:p>
     <w:p>
@@ -2939,10 +3016,7 @@
         </w:rPr>
       </w:pPr>
       <w:r>
-        <w:t xml:space="preserve">&lt;interlock&gt; </w:t>
-      </w:r>
-      <w:r>
-        <w:t xml:space="preserve">- interlock state (int), 0 – ok, 1 – alarm </w:t>
+        <w:t xml:space="preserve">&lt;interlock&gt; - interlock state (int), 0 – ok, 1 – alarm </w:t>
       </w:r>
     </w:p>
     <w:p>
@@ -2957,10 +3031,7 @@
         </w:rPr>
       </w:pPr>
       <w:r>
-        <w:t xml:space="preserve">&lt;emergency&gt; </w:t>
-      </w:r>
-      <w:r>
-        <w:t>- emergency state (int), 0 – ok, 1 – alarm</w:t>
+        <w:t>&lt;emergency&gt; - emergency state (int), 0 – ok, 1 – alarm</w:t>
       </w:r>
     </w:p>
     <w:p>
@@ -2983,10 +3054,7 @@
       </w:r>
       <w:proofErr w:type="spellEnd"/>
       <w:r>
-        <w:t xml:space="preserve">&gt; </w:t>
-      </w:r>
-      <w:r>
-        <w:t xml:space="preserve">- chiller fail (int), 0 – ok, 1 – alarm </w:t>
+        <w:t xml:space="preserve">&gt; - chiller fail (int), 0 – ok, 1 – alarm </w:t>
       </w:r>
     </w:p>
     <w:p>
@@ -2998,38 +3066,10 @@
         </w:numPr>
         <w:rPr>
           <w:rFonts w:cs="Arial"/>
-          <w:highlight w:val="yellow"/>
-        </w:rPr>
-      </w:pPr>
-      <w:r>
-        <w:rPr>
-          <w:highlight w:val="yellow"/>
-        </w:rPr>
-        <w:t>&lt;</w:t>
-      </w:r>
-      <w:r>
-        <w:rPr>
-          <w:highlight w:val="yellow"/>
-        </w:rPr>
-        <w:t>overheat</w:t>
-      </w:r>
-      <w:r>
-        <w:rPr>
-          <w:highlight w:val="yellow"/>
-        </w:rPr>
-        <w:t xml:space="preserve">&gt; - </w:t>
-      </w:r>
-      <w:r>
-        <w:rPr>
-          <w:highlight w:val="yellow"/>
-        </w:rPr>
-        <w:t>overheat state</w:t>
-      </w:r>
-      <w:r>
-        <w:rPr>
-          <w:highlight w:val="yellow"/>
-        </w:rPr>
-        <w:t xml:space="preserve"> (int), 0 – ok, 1 – alarm </w:t>
+        </w:rPr>
+      </w:pPr>
+      <w:r>
+        <w:t xml:space="preserve">&lt;overheat&gt; - overheat state (int), 0 – ok, 1 – alarm </w:t>
       </w:r>
     </w:p>
     <w:p>
@@ -3052,10 +3092,7 @@
       </w:r>
       <w:proofErr w:type="spellEnd"/>
       <w:r>
-        <w:t xml:space="preserve">&gt; </w:t>
-      </w:r>
-      <w:r>
-        <w:t xml:space="preserve">- seed emission state (int), 0 – off, 1 – on </w:t>
+        <w:t xml:space="preserve">&gt; - seed emission state (int), 0 – off, 1 – on </w:t>
       </w:r>
     </w:p>
     <w:p>
@@ -3088,10 +3125,7 @@
       </w:r>
       <w:proofErr w:type="spellEnd"/>
       <w:r>
-        <w:t xml:space="preserve">&gt; </w:t>
-      </w:r>
-      <w:r>
-        <w:t xml:space="preserve">- power supply work </w:t>
+        <w:t xml:space="preserve">&gt; - power supply work </w:t>
       </w:r>
       <w:r>
         <w:t>permission (int) 0 – off, 1 – on</w:t>
@@ -3222,13 +3256,41 @@
         <w:rPr>
           <w:lang w:val="fr-FR"/>
         </w:rPr>
-        <w:t>&lt;quant_mode&gt;</w:t>
+        <w:t xml:space="preserve">&lt;quant_mode&gt; - quantron sync mode (int) 0 – Internal, 1 </w:t>
       </w:r>
       <w:r>
         <w:rPr>
           <w:lang w:val="fr-FR"/>
         </w:rPr>
-        <w:t xml:space="preserve"> - quantron sync mode (int) 0 – Internal, 1 - External</w:t>
+        <w:t>–</w:t>
+      </w:r>
+      <w:r>
+        <w:rPr>
+          <w:lang w:val="fr-FR"/>
+        </w:rPr>
+        <w:t xml:space="preserve"> External</w:t>
+      </w:r>
+    </w:p>
+    <w:p>
+      <w:pPr>
+        <w:pStyle w:val="a0"/>
+        <w:numPr>
+          <w:ilvl w:val="0"/>
+          <w:numId w:val="14"/>
+        </w:numPr>
+        <w:suppressAutoHyphens/>
+        <w:spacing w:after="0" w:line="240" w:lineRule="auto"/>
+        <w:rPr>
+          <w:highlight w:val="yellow"/>
+          <w:lang w:val="fr-FR"/>
+        </w:rPr>
+      </w:pPr>
+      <w:r>
+        <w:rPr>
+          <w:highlight w:val="yellow"/>
+          <w:lang w:val="fr-FR"/>
+        </w:rPr>
+        <w:t>&lt;pocels_div&gt; - pocels divider (int) 1-254</w:t>
       </w:r>
     </w:p>
     <w:p>
@@ -3241,9 +3303,244 @@
     </w:p>
     <w:p>
       <w:pPr>
+        <w:pStyle w:val="20"/>
+        <w:rPr>
+          <w:highlight w:val="yellow"/>
+        </w:rPr>
+      </w:pPr>
+      <w:bookmarkStart w:id="10" w:name="_Toc192596368"/>
+      <w:bookmarkStart w:id="11" w:name="_Toc226801185"/>
+      <w:r>
+        <w:rPr>
+          <w:highlight w:val="yellow"/>
+        </w:rPr>
+        <w:t>Request to set emission on/off state</w:t>
+      </w:r>
+      <w:bookmarkEnd w:id="10"/>
+      <w:bookmarkEnd w:id="11"/>
+    </w:p>
+    <w:p>
+      <w:pPr>
+        <w:pStyle w:val="Requeststyle"/>
+        <w:rPr>
+          <w:highlight w:val="yellow"/>
+        </w:rPr>
+      </w:pPr>
+      <w:r>
+        <w:rPr>
+          <w:highlight w:val="yellow"/>
+        </w:rPr>
+        <w:t>“</w:t>
+      </w:r>
+      <w:proofErr w:type="spellStart"/>
+      <w:r>
+        <w:rPr>
+          <w:highlight w:val="yellow"/>
+        </w:rPr>
+        <w:t>lsonoff</w:t>
+      </w:r>
+      <w:proofErr w:type="spellEnd"/>
+      <w:r>
+        <w:rPr>
+          <w:highlight w:val="yellow"/>
+        </w:rPr>
+        <w:t xml:space="preserve"> </w:t>
+      </w:r>
+      <w:proofErr w:type="spellStart"/>
+      <w:r>
+        <w:rPr>
+          <w:highlight w:val="yellow"/>
+        </w:rPr>
+        <w:t>usr</w:t>
+      </w:r>
+      <w:proofErr w:type="spellEnd"/>
+      <w:r>
+        <w:rPr>
+          <w:highlight w:val="yellow"/>
+        </w:rPr>
+        <w:t xml:space="preserve"> &lt;id&gt; &lt;value&gt;\r”</w:t>
+      </w:r>
+    </w:p>
+    <w:p>
+      <w:pPr>
+        <w:rPr>
+          <w:highlight w:val="yellow"/>
+        </w:rPr>
+      </w:pPr>
+      <w:r>
+        <w:rPr>
+          <w:highlight w:val="yellow"/>
+        </w:rPr>
+        <w:t>Response:</w:t>
+      </w:r>
+    </w:p>
+    <w:p>
+      <w:pPr>
+        <w:pStyle w:val="Responsestyle"/>
+        <w:rPr>
+          <w:highlight w:val="yellow"/>
+        </w:rPr>
+      </w:pPr>
+      <w:r>
+        <w:rPr>
+          <w:highlight w:val="yellow"/>
+        </w:rPr>
+        <w:t>“</w:t>
+      </w:r>
+      <w:proofErr w:type="spellStart"/>
+      <w:r>
+        <w:rPr>
+          <w:highlight w:val="yellow"/>
+        </w:rPr>
+        <w:t>lronoff</w:t>
+      </w:r>
+      <w:proofErr w:type="spellEnd"/>
+      <w:r>
+        <w:rPr>
+          <w:highlight w:val="yellow"/>
+        </w:rPr>
+        <w:t xml:space="preserve"> </w:t>
+      </w:r>
+      <w:proofErr w:type="spellStart"/>
+      <w:r>
+        <w:rPr>
+          <w:highlight w:val="yellow"/>
+        </w:rPr>
+        <w:t>usr</w:t>
+      </w:r>
+      <w:proofErr w:type="spellEnd"/>
+      <w:r>
+        <w:rPr>
+          <w:highlight w:val="yellow"/>
+        </w:rPr>
+        <w:t xml:space="preserve"> &lt;id&gt; &lt;value&gt;\r”</w:t>
+      </w:r>
+    </w:p>
+    <w:p>
+      <w:pPr>
+        <w:rPr>
+          <w:highlight w:val="yellow"/>
+        </w:rPr>
+      </w:pPr>
+      <w:r>
+        <w:rPr>
+          <w:highlight w:val="yellow"/>
+        </w:rPr>
+        <w:t>ERROR Response:</w:t>
+      </w:r>
+    </w:p>
+    <w:p>
+      <w:pPr>
+        <w:pStyle w:val="Responsestyle"/>
+        <w:rPr>
+          <w:highlight w:val="yellow"/>
+        </w:rPr>
+      </w:pPr>
+      <w:r>
+        <w:rPr>
+          <w:highlight w:val="yellow"/>
+        </w:rPr>
+        <w:t>“</w:t>
+      </w:r>
+      <w:proofErr w:type="spellStart"/>
+      <w:r>
+        <w:rPr>
+          <w:highlight w:val="yellow"/>
+        </w:rPr>
+        <w:t>lronoff</w:t>
+      </w:r>
+      <w:proofErr w:type="spellEnd"/>
+      <w:r>
+        <w:rPr>
+          <w:highlight w:val="yellow"/>
+        </w:rPr>
+        <w:t xml:space="preserve"> </w:t>
+      </w:r>
+      <w:proofErr w:type="spellStart"/>
+      <w:r>
+        <w:rPr>
+          <w:highlight w:val="yellow"/>
+        </w:rPr>
+        <w:t>usr</w:t>
+      </w:r>
+      <w:proofErr w:type="spellEnd"/>
+      <w:r>
+        <w:rPr>
+          <w:highlight w:val="yellow"/>
+        </w:rPr>
+        <w:t xml:space="preserve"> &lt;id&gt; ERR\r”</w:t>
+      </w:r>
+    </w:p>
+    <w:p>
+      <w:pPr>
+        <w:rPr>
+          <w:highlight w:val="yellow"/>
+        </w:rPr>
+      </w:pPr>
+      <w:bookmarkStart w:id="12" w:name="_Toc192596369"/>
+      <w:r>
+        <w:rPr>
+          <w:highlight w:val="yellow"/>
+        </w:rPr>
+        <w:t>Where:</w:t>
+      </w:r>
+    </w:p>
+    <w:p>
+      <w:pPr>
+        <w:pStyle w:val="a0"/>
+        <w:numPr>
+          <w:ilvl w:val="0"/>
+          <w:numId w:val="27"/>
+        </w:numPr>
+        <w:suppressAutoHyphens/>
+        <w:spacing w:after="0" w:line="240" w:lineRule="auto"/>
+        <w:ind w:hanging="436"/>
+        <w:rPr>
+          <w:rStyle w:val="jlqj4b"/>
+          <w:highlight w:val="yellow"/>
+        </w:rPr>
+      </w:pPr>
+      <w:r>
+        <w:rPr>
+          <w:rStyle w:val="jlqj4b"/>
+          <w:highlight w:val="yellow"/>
+        </w:rPr>
+        <w:t>&lt;id&gt; - device id (int), 0 if device is single</w:t>
+      </w:r>
+    </w:p>
+    <w:p>
+      <w:pPr>
+        <w:pStyle w:val="a0"/>
+        <w:numPr>
+          <w:ilvl w:val="0"/>
+          <w:numId w:val="27"/>
+        </w:numPr>
+        <w:suppressAutoHyphens/>
+        <w:spacing w:after="0" w:line="240" w:lineRule="auto"/>
+        <w:ind w:hanging="436"/>
+        <w:rPr>
+          <w:highlight w:val="yellow"/>
+        </w:rPr>
+      </w:pPr>
+      <w:r>
+        <w:rPr>
+          <w:highlight w:val="yellow"/>
+        </w:rPr>
+        <w:t>&lt;value&gt; - emission state value, (int) 0 – off, 1 – on</w:t>
+      </w:r>
+      <w:bookmarkEnd w:id="12"/>
+    </w:p>
+    <w:p>
+      <w:pPr>
         <w:rPr>
           <w:highlight w:val="black"/>
-          <w:lang w:val="fr-FR"/>
+        </w:rPr>
+      </w:pPr>
+    </w:p>
+    <w:p>
+      <w:pPr>
+        <w:rPr>
+          <w:highlight w:val="black"/>
         </w:rPr>
       </w:pPr>
     </w:p>
@@ -3251,11 +3548,11 @@
       <w:pPr>
         <w:pStyle w:val="20"/>
       </w:pPr>
-      <w:bookmarkStart w:id="10" w:name="_Toc226291974"/>
+      <w:bookmarkStart w:id="13" w:name="_Toc226801186"/>
       <w:r>
         <w:t>Request to set mode</w:t>
       </w:r>
-      <w:bookmarkEnd w:id="10"/>
+      <w:bookmarkEnd w:id="13"/>
     </w:p>
     <w:p>
       <w:pPr>
@@ -3297,12 +3594,10 @@
         <w:t>“</w:t>
       </w:r>
       <w:proofErr w:type="spellStart"/>
-      <w:proofErr w:type="gramStart"/>
       <w:r>
         <w:t>lrmode</w:t>
       </w:r>
       <w:proofErr w:type="spellEnd"/>
-      <w:proofErr w:type="gramEnd"/>
       <w:r>
         <w:t xml:space="preserve"> </w:t>
       </w:r>
@@ -3318,6 +3613,7 @@
     <w:p/>
     <w:p>
       <w:r>
+        <w:lastRenderedPageBreak/>
         <w:t>ERROR response:</w:t>
       </w:r>
     </w:p>
@@ -3329,12 +3625,10 @@
         <w:t>“</w:t>
       </w:r>
       <w:proofErr w:type="spellStart"/>
-      <w:proofErr w:type="gramStart"/>
       <w:r>
         <w:t>lrmode</w:t>
       </w:r>
       <w:proofErr w:type="spellEnd"/>
-      <w:proofErr w:type="gramEnd"/>
       <w:r>
         <w:t xml:space="preserve"> </w:t>
       </w:r>
@@ -3400,7 +3694,322 @@
         <w:rPr>
           <w:lang w:val="fr-FR"/>
         </w:rPr>
-        <w:t xml:space="preserve"> - quantron sync mode (int) 0 – Internal, 1 - External</w:t>
+        <w:t xml:space="preserve"> - quantron sync mode (int) 0 – Internal, 1 </w:t>
+      </w:r>
+      <w:r>
+        <w:rPr>
+          <w:lang w:val="fr-FR"/>
+        </w:rPr>
+        <w:t>–</w:t>
+      </w:r>
+      <w:r>
+        <w:rPr>
+          <w:lang w:val="fr-FR"/>
+        </w:rPr>
+        <w:t xml:space="preserve"> External</w:t>
+      </w:r>
+    </w:p>
+    <w:p>
+      <w:pPr>
+        <w:suppressAutoHyphens/>
+        <w:spacing w:after="0" w:line="240" w:lineRule="auto"/>
+        <w:rPr>
+          <w:lang w:val="fr-FR"/>
+        </w:rPr>
+      </w:pPr>
+    </w:p>
+    <w:p>
+      <w:pPr>
+        <w:pStyle w:val="20"/>
+        <w:rPr>
+          <w:highlight w:val="yellow"/>
+        </w:rPr>
+      </w:pPr>
+      <w:bookmarkStart w:id="14" w:name="_Toc226801187"/>
+      <w:r>
+        <w:rPr>
+          <w:highlight w:val="yellow"/>
+        </w:rPr>
+        <w:t>Request to set mode</w:t>
+      </w:r>
+      <w:bookmarkEnd w:id="14"/>
+    </w:p>
+    <w:p>
+      <w:pPr>
+        <w:pStyle w:val="Requeststyle"/>
+        <w:rPr>
+          <w:highlight w:val="yellow"/>
+        </w:rPr>
+      </w:pPr>
+      <w:r>
+        <w:rPr>
+          <w:highlight w:val="yellow"/>
+        </w:rPr>
+        <w:t>"</w:t>
+      </w:r>
+      <w:proofErr w:type="spellStart"/>
+      <w:r>
+        <w:rPr>
+          <w:highlight w:val="yellow"/>
+        </w:rPr>
+        <w:t>ls</w:t>
+      </w:r>
+      <w:r>
+        <w:rPr>
+          <w:highlight w:val="yellow"/>
+        </w:rPr>
+        <w:t>div</w:t>
+      </w:r>
+      <w:proofErr w:type="spellEnd"/>
+      <w:r>
+        <w:rPr>
+          <w:highlight w:val="yellow"/>
+        </w:rPr>
+        <w:t xml:space="preserve"> </w:t>
+      </w:r>
+      <w:proofErr w:type="spellStart"/>
+      <w:r>
+        <w:rPr>
+          <w:highlight w:val="yellow"/>
+        </w:rPr>
+        <w:t>usr</w:t>
+      </w:r>
+      <w:proofErr w:type="spellEnd"/>
+      <w:r>
+        <w:rPr>
+          <w:highlight w:val="yellow"/>
+        </w:rPr>
+        <w:t xml:space="preserve"> &lt;id&gt; &lt;value&gt;\r"</w:t>
+      </w:r>
+    </w:p>
+    <w:p>
+      <w:pPr>
+        <w:rPr>
+          <w:highlight w:val="yellow"/>
+        </w:rPr>
+      </w:pPr>
+      <w:r>
+        <w:rPr>
+          <w:highlight w:val="yellow"/>
+        </w:rPr>
+        <w:t>Response:</w:t>
+      </w:r>
+      <w:r>
+        <w:rPr>
+          <w:highlight w:val="yellow"/>
+        </w:rPr>
+        <w:tab/>
+      </w:r>
+    </w:p>
+    <w:p>
+      <w:pPr>
+        <w:pStyle w:val="Responsestyle"/>
+        <w:rPr>
+          <w:highlight w:val="yellow"/>
+        </w:rPr>
+      </w:pPr>
+      <w:r>
+        <w:rPr>
+          <w:highlight w:val="yellow"/>
+        </w:rPr>
+        <w:t>“</w:t>
+      </w:r>
+      <w:proofErr w:type="spellStart"/>
+      <w:r>
+        <w:rPr>
+          <w:highlight w:val="yellow"/>
+        </w:rPr>
+        <w:t>lr</w:t>
+      </w:r>
+      <w:r>
+        <w:rPr>
+          <w:highlight w:val="yellow"/>
+        </w:rPr>
+        <w:t>div</w:t>
+      </w:r>
+      <w:proofErr w:type="spellEnd"/>
+      <w:r>
+        <w:rPr>
+          <w:highlight w:val="yellow"/>
+        </w:rPr>
+        <w:t xml:space="preserve"> </w:t>
+      </w:r>
+      <w:proofErr w:type="spellStart"/>
+      <w:r>
+        <w:rPr>
+          <w:highlight w:val="yellow"/>
+        </w:rPr>
+        <w:t>usr</w:t>
+      </w:r>
+      <w:proofErr w:type="spellEnd"/>
+      <w:r>
+        <w:rPr>
+          <w:highlight w:val="yellow"/>
+        </w:rPr>
+        <w:t xml:space="preserve"> &lt;id&gt; &lt;value&gt;\r"</w:t>
+      </w:r>
+    </w:p>
+    <w:p>
+      <w:pPr>
+        <w:rPr>
+          <w:highlight w:val="yellow"/>
+        </w:rPr>
+      </w:pPr>
+    </w:p>
+    <w:p>
+      <w:pPr>
+        <w:rPr>
+          <w:highlight w:val="yellow"/>
+        </w:rPr>
+      </w:pPr>
+      <w:r>
+        <w:rPr>
+          <w:highlight w:val="yellow"/>
+        </w:rPr>
+        <w:t>ERROR response:</w:t>
+      </w:r>
+    </w:p>
+    <w:p>
+      <w:pPr>
+        <w:pStyle w:val="Responsestyle"/>
+        <w:rPr>
+          <w:highlight w:val="yellow"/>
+        </w:rPr>
+      </w:pPr>
+      <w:r>
+        <w:rPr>
+          <w:highlight w:val="yellow"/>
+        </w:rPr>
+        <w:t>“</w:t>
+      </w:r>
+      <w:proofErr w:type="spellStart"/>
+      <w:r>
+        <w:rPr>
+          <w:highlight w:val="yellow"/>
+        </w:rPr>
+        <w:t>lr</w:t>
+      </w:r>
+      <w:r>
+        <w:rPr>
+          <w:highlight w:val="yellow"/>
+        </w:rPr>
+        <w:t>div</w:t>
+      </w:r>
+      <w:proofErr w:type="spellEnd"/>
+      <w:r>
+        <w:rPr>
+          <w:highlight w:val="yellow"/>
+        </w:rPr>
+        <w:t xml:space="preserve"> </w:t>
+      </w:r>
+      <w:proofErr w:type="spellStart"/>
+      <w:r>
+        <w:rPr>
+          <w:highlight w:val="yellow"/>
+        </w:rPr>
+        <w:t>usr</w:t>
+      </w:r>
+      <w:proofErr w:type="spellEnd"/>
+      <w:r>
+        <w:rPr>
+          <w:highlight w:val="yellow"/>
+        </w:rPr>
+        <w:t xml:space="preserve"> &lt;id&gt; ERR\r”</w:t>
+      </w:r>
+    </w:p>
+    <w:p>
+      <w:pPr>
+        <w:rPr>
+          <w:highlight w:val="yellow"/>
+        </w:rPr>
+      </w:pPr>
+    </w:p>
+    <w:p>
+      <w:pPr>
+        <w:rPr>
+          <w:highlight w:val="yellow"/>
+        </w:rPr>
+      </w:pPr>
+      <w:r>
+        <w:rPr>
+          <w:highlight w:val="yellow"/>
+        </w:rPr>
+        <w:t xml:space="preserve">Where:  </w:t>
+      </w:r>
+    </w:p>
+    <w:p>
+      <w:pPr>
+        <w:pStyle w:val="a0"/>
+        <w:numPr>
+          <w:ilvl w:val="0"/>
+          <w:numId w:val="7"/>
+        </w:numPr>
+        <w:rPr>
+          <w:highlight w:val="yellow"/>
+        </w:rPr>
+      </w:pPr>
+      <w:r>
+        <w:rPr>
+          <w:highlight w:val="yellow"/>
+        </w:rPr>
+        <w:t>&lt;id&gt; - device id, (int); always 0.</w:t>
+      </w:r>
+    </w:p>
+    <w:p>
+      <w:pPr>
+        <w:pStyle w:val="a0"/>
+        <w:numPr>
+          <w:ilvl w:val="0"/>
+          <w:numId w:val="7"/>
+        </w:numPr>
+        <w:suppressAutoHyphens/>
+        <w:spacing w:after="0" w:line="240" w:lineRule="auto"/>
+        <w:rPr>
+          <w:highlight w:val="yellow"/>
+          <w:lang w:val="fr-FR"/>
+        </w:rPr>
+      </w:pPr>
+      <w:r>
+        <w:rPr>
+          <w:highlight w:val="yellow"/>
+          <w:lang w:val="fr-FR"/>
+        </w:rPr>
+        <w:t xml:space="preserve">&lt;value&gt; - </w:t>
+      </w:r>
+      <w:r>
+        <w:rPr>
+          <w:highlight w:val="yellow"/>
+          <w:lang w:val="fr-FR"/>
+        </w:rPr>
+        <w:t xml:space="preserve">pocels puls divider </w:t>
+      </w:r>
+      <w:r>
+        <w:rPr>
+          <w:highlight w:val="yellow"/>
+          <w:lang w:val="fr-FR"/>
+        </w:rPr>
+        <w:t xml:space="preserve">(int) </w:t>
+      </w:r>
+      <w:r>
+        <w:rPr>
+          <w:highlight w:val="yellow"/>
+          <w:lang w:val="fr-FR"/>
+        </w:rPr>
+        <w:t>1</w:t>
+      </w:r>
+      <w:r>
+        <w:rPr>
+          <w:highlight w:val="yellow"/>
+          <w:lang w:val="fr-FR"/>
+        </w:rPr>
+        <w:t xml:space="preserve"> – </w:t>
+      </w:r>
+      <w:r>
+        <w:rPr>
+          <w:highlight w:val="yellow"/>
+          <w:lang w:val="fr-FR"/>
+        </w:rPr>
+        <w:t>254</w:t>
       </w:r>
     </w:p>
     <w:p>
@@ -3439,15 +4048,14 @@
       <w:pPr>
         <w:pStyle w:val="20"/>
       </w:pPr>
-      <w:bookmarkStart w:id="11" w:name="_Toc226291975"/>
-      <w:r>
-        <w:lastRenderedPageBreak/>
+      <w:bookmarkStart w:id="15" w:name="_Toc226801188"/>
+      <w:r>
         <w:t xml:space="preserve">Request to set </w:t>
       </w:r>
-      <w:bookmarkEnd w:id="11"/>
       <w:r>
         <w:t>PSU permission</w:t>
       </w:r>
+      <w:bookmarkEnd w:id="15"/>
     </w:p>
     <w:p>
       <w:pPr>
@@ -3492,7 +4100,6 @@
         <w:t>“</w:t>
       </w:r>
       <w:proofErr w:type="spellStart"/>
-      <w:proofErr w:type="gramStart"/>
       <w:r>
         <w:t>l</w:t>
       </w:r>
@@ -3500,7 +4107,6 @@
         <w:t>rpsupermission</w:t>
       </w:r>
       <w:proofErr w:type="spellEnd"/>
-      <w:proofErr w:type="gramEnd"/>
       <w:r>
         <w:t xml:space="preserve"> </w:t>
       </w:r>
@@ -3526,7 +4132,6 @@
         <w:t>“</w:t>
       </w:r>
       <w:proofErr w:type="spellStart"/>
-      <w:proofErr w:type="gramStart"/>
       <w:r>
         <w:t>l</w:t>
       </w:r>
@@ -3534,7 +4139,6 @@
         <w:t>rpsupermission</w:t>
       </w:r>
       <w:proofErr w:type="spellEnd"/>
-      <w:proofErr w:type="gramEnd"/>
       <w:r>
         <w:t xml:space="preserve"> </w:t>
       </w:r>
@@ -3597,12 +4201,14 @@
       <w:pPr>
         <w:pStyle w:val="20"/>
       </w:pPr>
+      <w:bookmarkStart w:id="16" w:name="_Toc226801189"/>
       <w:r>
         <w:t xml:space="preserve">Request to </w:t>
       </w:r>
       <w:r>
         <w:t>clear errors</w:t>
       </w:r>
+      <w:bookmarkEnd w:id="16"/>
     </w:p>
     <w:p>
       <w:pPr>
@@ -3647,7 +4253,6 @@
         <w:t>“</w:t>
       </w:r>
       <w:proofErr w:type="spellStart"/>
-      <w:proofErr w:type="gramStart"/>
       <w:r>
         <w:t>l</w:t>
       </w:r>
@@ -3655,7 +4260,6 @@
         <w:t>rerrclr</w:t>
       </w:r>
       <w:proofErr w:type="spellEnd"/>
-      <w:proofErr w:type="gramEnd"/>
       <w:r>
         <w:t xml:space="preserve"> </w:t>
       </w:r>
@@ -3670,6 +4274,7 @@
     </w:p>
     <w:p>
       <w:r>
+        <w:lastRenderedPageBreak/>
         <w:t>ERROR response:</w:t>
       </w:r>
     </w:p>
@@ -3681,7 +4286,6 @@
         <w:t>“</w:t>
       </w:r>
       <w:proofErr w:type="spellStart"/>
-      <w:proofErr w:type="gramStart"/>
       <w:r>
         <w:t>l</w:t>
       </w:r>
@@ -3689,7 +4293,6 @@
         <w:t>rerrclr</w:t>
       </w:r>
       <w:proofErr w:type="spellEnd"/>
-      <w:proofErr w:type="gramEnd"/>
       <w:r>
         <w:t xml:space="preserve"> </w:t>
       </w:r>
@@ -3731,7 +4334,7 @@
       <w:pPr>
         <w:pStyle w:val="20"/>
       </w:pPr>
-      <w:bookmarkStart w:id="12" w:name="_Toc226291976"/>
+      <w:bookmarkStart w:id="17" w:name="_Toc226801190"/>
       <w:r>
         <w:t xml:space="preserve">Request to set </w:t>
       </w:r>
@@ -3746,7 +4349,7 @@
       <w:r>
         <w:t>pulse frequency</w:t>
       </w:r>
-      <w:bookmarkEnd w:id="12"/>
+      <w:bookmarkEnd w:id="17"/>
       <w:r>
         <w:t xml:space="preserve"> </w:t>
       </w:r>
@@ -3791,12 +4394,10 @@
         <w:t>“</w:t>
       </w:r>
       <w:proofErr w:type="spellStart"/>
-      <w:proofErr w:type="gramStart"/>
       <w:r>
         <w:t>lrfreq</w:t>
       </w:r>
       <w:proofErr w:type="spellEnd"/>
-      <w:proofErr w:type="gramEnd"/>
       <w:r>
         <w:t xml:space="preserve"> </w:t>
       </w:r>
@@ -3822,12 +4423,10 @@
         <w:t>“</w:t>
       </w:r>
       <w:proofErr w:type="spellStart"/>
-      <w:proofErr w:type="gramStart"/>
       <w:r>
         <w:t>lrfreq</w:t>
       </w:r>
       <w:proofErr w:type="spellEnd"/>
-      <w:proofErr w:type="gramEnd"/>
       <w:r>
         <w:t xml:space="preserve"> </w:t>
       </w:r>
@@ -3938,9 +4537,8 @@
       <w:pPr>
         <w:pStyle w:val="20"/>
       </w:pPr>
-      <w:bookmarkStart w:id="13" w:name="_Toc226291979"/>
-      <w:r>
-        <w:lastRenderedPageBreak/>
+      <w:bookmarkStart w:id="18" w:name="_Toc226801191"/>
+      <w:r>
         <w:t xml:space="preserve">Request set </w:t>
       </w:r>
       <w:r>
@@ -3953,7 +4551,7 @@
       <w:r>
         <w:t>ation</w:t>
       </w:r>
-      <w:bookmarkEnd w:id="13"/>
+      <w:bookmarkEnd w:id="18"/>
       <w:proofErr w:type="spellEnd"/>
     </w:p>
     <w:p>
@@ -4159,32 +4757,33 @@
       <w:pPr>
         <w:pStyle w:val="1"/>
       </w:pPr>
-      <w:bookmarkStart w:id="14" w:name="_Toc226291980"/>
-      <w:r>
+      <w:bookmarkStart w:id="19" w:name="_Toc226801192"/>
+      <w:r>
+        <w:lastRenderedPageBreak/>
         <w:t>Admin commands</w:t>
       </w:r>
-      <w:bookmarkEnd w:id="14"/>
+      <w:bookmarkEnd w:id="19"/>
     </w:p>
     <w:p>
       <w:pPr>
         <w:pStyle w:val="20"/>
       </w:pPr>
-      <w:bookmarkStart w:id="15" w:name="_Toc226291981"/>
-      <w:r>
-        <w:t>Request set configuration</w:t>
-      </w:r>
-      <w:bookmarkEnd w:id="15"/>
+      <w:bookmarkStart w:id="20" w:name="_Toc226801193"/>
+      <w:r>
+        <w:t>Status request</w:t>
+      </w:r>
+      <w:bookmarkEnd w:id="20"/>
     </w:p>
     <w:p>
       <w:pPr>
         <w:pStyle w:val="Requeststyle"/>
       </w:pPr>
       <w:r>
-        <w:t>"</w:t>
-      </w:r>
-      <w:proofErr w:type="spellStart"/>
-      <w:r>
-        <w:t>lsconf</w:t>
+        <w:t>“</w:t>
+      </w:r>
+      <w:proofErr w:type="spellStart"/>
+      <w:r>
+        <w:t>lgstatus</w:t>
       </w:r>
       <w:proofErr w:type="spellEnd"/>
       <w:r>
@@ -4196,86 +4795,81 @@
       </w:r>
       <w:proofErr w:type="spellEnd"/>
       <w:r>
-        <w:t xml:space="preserve"> &lt;id&gt;</w:t>
-      </w:r>
+        <w:t xml:space="preserve"> &lt;id&gt;\r”</w:t>
+      </w:r>
+    </w:p>
+    <w:p>
+      <w:r>
+        <w:t>Response:</w:t>
+      </w:r>
+    </w:p>
+    <w:p>
+      <w:pPr>
+        <w:pStyle w:val="Responsestyle"/>
+      </w:pPr>
+      <w:r>
+        <w:t>“</w:t>
+      </w:r>
+      <w:proofErr w:type="spellStart"/>
+      <w:r>
+        <w:t>lrstatus</w:t>
+      </w:r>
+      <w:proofErr w:type="spellEnd"/>
       <w:r>
         <w:t xml:space="preserve"> </w:t>
       </w:r>
-      <w:r>
-        <w:t xml:space="preserve">&lt;tec_state0&gt; </w:t>
-      </w:r>
-      <w:r>
-        <w:t>&lt;tec_temp</w:t>
-      </w:r>
-      <w:r>
-        <w:t xml:space="preserve">0&gt; &lt;tec_state1&gt; </w:t>
-      </w:r>
-      <w:r>
-        <w:t>&lt;tec_temp</w:t>
-      </w:r>
-      <w:r>
-        <w:t>1&gt; &lt;tec_state</w:t>
-      </w:r>
-      <w:r>
-        <w:t>2</w:t>
-      </w:r>
-      <w:r>
-        <w:t xml:space="preserve">&gt; </w:t>
-      </w:r>
-      <w:r>
-        <w:t>&lt;tec_temp</w:t>
-      </w:r>
-      <w:r>
-        <w:t>2</w:t>
-      </w:r>
-      <w:r>
-        <w:t>&gt; &lt;tec_state</w:t>
-      </w:r>
-      <w:r>
-        <w:t>3</w:t>
-      </w:r>
-      <w:r>
-        <w:t xml:space="preserve">&gt; </w:t>
-      </w:r>
-      <w:r>
-        <w:t>&lt;tec_temp</w:t>
-      </w:r>
-      <w:r>
-        <w:t>3</w:t>
-      </w:r>
-      <w:r>
-        <w:t xml:space="preserve">&gt; </w:t>
-      </w:r>
-      <w:r>
-        <w:t>&lt;</w:t>
-      </w:r>
-      <w:proofErr w:type="spellStart"/>
-      <w:r>
-        <w:t>hpld_curr</w:t>
-      </w:r>
-      <w:proofErr w:type="spellEnd"/>
-      <w:r>
-        <w:t>&gt;</w:t>
-      </w:r>
-      <w:r>
-        <w:t xml:space="preserve"> &lt;tec_max0&gt; &lt;tec_max1&gt; &lt;tec_max2&gt; &lt;tec_max3&gt; &lt;temp_max0&gt; &lt;temp_max1&gt;</w:t>
-      </w:r>
-      <w:r>
-        <w:t>\r"</w:t>
-      </w:r>
-    </w:p>
-    <w:p>
-      <w:pPr>
-        <w:spacing w:before="120" w:after="40"/>
-        <w:rPr>
-          <w:rFonts w:cs="Arial"/>
-        </w:rPr>
-      </w:pPr>
-      <w:r>
-        <w:rPr>
-          <w:rFonts w:cs="Arial"/>
-        </w:rPr>
-        <w:t>Response:</w:t>
+      <w:proofErr w:type="spellStart"/>
+      <w:r>
+        <w:t>admn</w:t>
+      </w:r>
+      <w:proofErr w:type="spellEnd"/>
+      <w:r>
+        <w:t xml:space="preserve"> &lt;id&gt; &lt;</w:t>
+      </w:r>
+      <w:proofErr w:type="spellStart"/>
+      <w:r>
+        <w:t>power_led</w:t>
+      </w:r>
+      <w:proofErr w:type="spellEnd"/>
+      <w:r>
+        <w:t>&gt; &lt;</w:t>
+      </w:r>
+      <w:proofErr w:type="spellStart"/>
+      <w:r>
+        <w:t>PSU_led</w:t>
+      </w:r>
+      <w:proofErr w:type="spellEnd"/>
+      <w:r>
+        <w:t>&gt; &lt;</w:t>
+      </w:r>
+      <w:proofErr w:type="spellStart"/>
+      <w:r>
+        <w:t>orange_led</w:t>
+      </w:r>
+      <w:proofErr w:type="spellEnd"/>
+      <w:r>
+        <w:t>&gt; &lt;</w:t>
+      </w:r>
+      <w:proofErr w:type="spellStart"/>
+      <w:r>
+        <w:t>red_led</w:t>
+      </w:r>
+      <w:proofErr w:type="spellEnd"/>
+      <w:r>
+        <w:t>&gt; &lt;</w:t>
+      </w:r>
+      <w:proofErr w:type="spellStart"/>
+      <w:r>
+        <w:t>err_code</w:t>
+      </w:r>
+      <w:proofErr w:type="spellEnd"/>
+      <w:r>
+        <w:t>&gt;\r”</w:t>
+      </w:r>
+    </w:p>
+    <w:p>
+      <w:r>
+        <w:t>ERROR Response:</w:t>
       </w:r>
     </w:p>
     <w:p>
@@ -4283,11 +4877,11 @@
         <w:pStyle w:val="Responsestyle"/>
       </w:pPr>
       <w:r>
-        <w:t>"</w:t>
-      </w:r>
-      <w:proofErr w:type="spellStart"/>
-      <w:r>
-        <w:t>lsconf</w:t>
+        <w:t>“</w:t>
+      </w:r>
+      <w:proofErr w:type="spellStart"/>
+      <w:r>
+        <w:t>lrstatus</w:t>
       </w:r>
       <w:proofErr w:type="spellEnd"/>
       <w:r>
@@ -4299,112 +4893,7 @@
       </w:r>
       <w:proofErr w:type="spellEnd"/>
       <w:r>
-        <w:t xml:space="preserve"> &lt;id&gt;</w:t>
-      </w:r>
-      <w:r>
-        <w:t xml:space="preserve"> &lt;</w:t>
-      </w:r>
-      <w:r>
-        <w:t xml:space="preserve">tec_state0&gt; </w:t>
-      </w:r>
-      <w:r>
-        <w:t>&lt;tec_temp</w:t>
-      </w:r>
-      <w:r>
-        <w:t xml:space="preserve">0&gt; &lt;tec_state1&gt; </w:t>
-      </w:r>
-      <w:r>
-        <w:t>&lt;tec_temp</w:t>
-      </w:r>
-      <w:r>
-        <w:t>1&gt; &lt;tec_state</w:t>
-      </w:r>
-      <w:r>
-        <w:t>2</w:t>
-      </w:r>
-      <w:r>
-        <w:t xml:space="preserve">&gt; </w:t>
-      </w:r>
-      <w:r>
-        <w:t>&lt;tec_temp</w:t>
-      </w:r>
-      <w:r>
-        <w:t>2</w:t>
-      </w:r>
-      <w:r>
-        <w:t>&gt; &lt;tec_state</w:t>
-      </w:r>
-      <w:r>
-        <w:t>3</w:t>
-      </w:r>
-      <w:r>
-        <w:t xml:space="preserve">&gt; </w:t>
-      </w:r>
-      <w:r>
-        <w:t>&lt;tec_temp</w:t>
-      </w:r>
-      <w:r>
-        <w:t>3</w:t>
-      </w:r>
-      <w:r>
-        <w:t xml:space="preserve">&gt; </w:t>
-      </w:r>
-      <w:r>
-        <w:t>&lt;</w:t>
-      </w:r>
-      <w:proofErr w:type="spellStart"/>
-      <w:r>
-        <w:t>hpld_curr</w:t>
-      </w:r>
-      <w:proofErr w:type="spellEnd"/>
-      <w:r>
-        <w:t>&gt;</w:t>
-      </w:r>
-      <w:r>
-        <w:t xml:space="preserve"> &lt;tec_max0&gt; &lt;tec_max1&gt; &lt;tec_max2&gt; &lt;tec_max3&gt; &lt;temp_max0&gt; &lt;temp_max1&gt;</w:t>
-      </w:r>
-      <w:r>
-        <w:t>\r"</w:t>
-      </w:r>
-    </w:p>
-    <w:p>
-      <w:pPr>
-        <w:spacing w:before="120" w:after="40"/>
-        <w:rPr>
-          <w:rFonts w:cs="Arial"/>
-        </w:rPr>
-      </w:pPr>
-      <w:r>
-        <w:rPr>
-          <w:rFonts w:cs="Arial"/>
-        </w:rPr>
-        <w:t>ERROR response:</w:t>
-      </w:r>
-    </w:p>
-    <w:p>
-      <w:pPr>
-        <w:pStyle w:val="Responsestyle"/>
-      </w:pPr>
-      <w:r>
-        <w:t>"</w:t>
-      </w:r>
-      <w:proofErr w:type="spellStart"/>
-      <w:proofErr w:type="gramStart"/>
-      <w:r>
-        <w:t>lrconf</w:t>
-      </w:r>
-      <w:proofErr w:type="spellEnd"/>
-      <w:proofErr w:type="gramEnd"/>
-      <w:r>
-        <w:t xml:space="preserve"> </w:t>
-      </w:r>
-      <w:proofErr w:type="spellStart"/>
-      <w:r>
-        <w:t>admn</w:t>
-      </w:r>
-      <w:proofErr w:type="spellEnd"/>
-      <w:r>
-        <w:t xml:space="preserve"> &lt;id&gt; ERR\r"</w:t>
+        <w:t xml:space="preserve"> &lt;id&gt; ERR\r”</w:t>
       </w:r>
     </w:p>
     <w:p>
@@ -4437,35 +4926,11 @@
       </w:r>
       <w:proofErr w:type="spellStart"/>
       <w:r>
-        <w:t>tec_</w:t>
-      </w:r>
-      <w:r>
-        <w:t>stateN</w:t>
-      </w:r>
-      <w:proofErr w:type="spellEnd"/>
-      <w:r>
-        <w:t>&gt; -</w:t>
-      </w:r>
-      <w:r>
-        <w:t xml:space="preserve"> N</w:t>
-      </w:r>
-      <w:r>
-        <w:t xml:space="preserve"> TEC </w:t>
-      </w:r>
-      <w:r>
-        <w:t>state value</w:t>
-      </w:r>
-      <w:r>
-        <w:t xml:space="preserve"> (</w:t>
-      </w:r>
-      <w:r>
-        <w:t>int</w:t>
-      </w:r>
-      <w:r>
-        <w:t xml:space="preserve">), </w:t>
-      </w:r>
-      <w:r>
-        <w:t>0 – off, 1 – on</w:t>
+        <w:t>power_led</w:t>
+      </w:r>
+      <w:proofErr w:type="spellEnd"/>
+      <w:r>
+        <w:t>&gt; - green power led state, (int) 0 – off, 1 - on</w:t>
       </w:r>
     </w:p>
     <w:p>
@@ -4481,35 +4946,11 @@
       </w:r>
       <w:proofErr w:type="spellStart"/>
       <w:r>
-        <w:t>tec_temp</w:t>
-      </w:r>
-      <w:r>
-        <w:t>N</w:t>
-      </w:r>
-      <w:proofErr w:type="spellEnd"/>
-      <w:r>
-        <w:t>&gt; -</w:t>
-      </w:r>
-      <w:r>
-        <w:t xml:space="preserve"> N</w:t>
-      </w:r>
-      <w:r>
-        <w:t xml:space="preserve"> TEC temperature setpoint (float), </w:t>
-      </w:r>
-      <w:r>
-        <w:t>10.0</w:t>
-      </w:r>
-      <w:r>
-        <w:t>0</w:t>
-      </w:r>
-      <w:r>
-        <w:t xml:space="preserve"> – 200.0</w:t>
-      </w:r>
-      <w:r>
-        <w:t>0</w:t>
-      </w:r>
-      <w:r>
-        <w:t xml:space="preserve"> C</w:t>
+        <w:t>PSU_led</w:t>
+      </w:r>
+      <w:proofErr w:type="spellEnd"/>
+      <w:r>
+        <w:t>&gt; - PSU green led state, (int) 0 – off, 1 - on</w:t>
       </w:r>
     </w:p>
     <w:p>
@@ -4525,20 +4966,11 @@
       </w:r>
       <w:proofErr w:type="spellStart"/>
       <w:r>
-        <w:t>hpld_curr</w:t>
-      </w:r>
-      <w:proofErr w:type="spellEnd"/>
-      <w:r>
-        <w:t xml:space="preserve">&gt; - </w:t>
-      </w:r>
-      <w:r>
-        <w:t>hpld-1000 stored current value</w:t>
-      </w:r>
-      <w:r>
-        <w:t xml:space="preserve"> (float), </w:t>
-      </w:r>
-      <w:r>
-        <w:t>0.00 – 26.00 A</w:t>
+        <w:t>orange_led</w:t>
+      </w:r>
+      <w:proofErr w:type="spellEnd"/>
+      <w:r>
+        <w:t>&gt; - emission orange led state, (int) 0 – off, 1 - on</w:t>
       </w:r>
     </w:p>
     <w:p>
@@ -4554,14 +4986,17 @@
       </w:r>
       <w:proofErr w:type="spellStart"/>
       <w:r>
-        <w:t>tec_maxN</w:t>
-      </w:r>
-      <w:proofErr w:type="spellEnd"/>
-      <w:r>
-        <w:t>&gt; - N TEC max temperature value</w:t>
-      </w:r>
-      <w:r>
-        <w:t xml:space="preserve"> (float), 0.00 – 200.00 C</w:t>
+        <w:t>red_led</w:t>
+      </w:r>
+      <w:proofErr w:type="spellEnd"/>
+      <w:r>
+        <w:t xml:space="preserve">&gt; - error red led state, (int) 0 – off, 1 </w:t>
+      </w:r>
+      <w:r>
+        <w:t>–</w:t>
+      </w:r>
+      <w:r>
+        <w:t xml:space="preserve"> on</w:t>
       </w:r>
     </w:p>
     <w:p>
@@ -4577,6 +5012,423 @@
       </w:r>
       <w:proofErr w:type="spellStart"/>
       <w:r>
+        <w:t>err_code</w:t>
+      </w:r>
+      <w:proofErr w:type="spellEnd"/>
+      <w:r>
+        <w:t>&gt; - error code, (int)</w:t>
+      </w:r>
+    </w:p>
+    <w:p>
+      <w:pPr>
+        <w:pStyle w:val="20"/>
+      </w:pPr>
+      <w:bookmarkStart w:id="21" w:name="_Toc226801194"/>
+      <w:r>
+        <w:t>Request set configuration</w:t>
+      </w:r>
+      <w:bookmarkEnd w:id="21"/>
+    </w:p>
+    <w:p>
+      <w:pPr>
+        <w:pStyle w:val="Requeststyle"/>
+      </w:pPr>
+      <w:r>
+        <w:t>"</w:t>
+      </w:r>
+      <w:proofErr w:type="spellStart"/>
+      <w:r>
+        <w:t>lsconf</w:t>
+      </w:r>
+      <w:proofErr w:type="spellEnd"/>
+      <w:r>
+        <w:t xml:space="preserve"> </w:t>
+      </w:r>
+      <w:proofErr w:type="spellStart"/>
+      <w:r>
+        <w:t>admn</w:t>
+      </w:r>
+      <w:proofErr w:type="spellEnd"/>
+      <w:r>
+        <w:t xml:space="preserve"> &lt;id&gt;</w:t>
+      </w:r>
+      <w:r>
+        <w:t xml:space="preserve"> </w:t>
+      </w:r>
+      <w:r>
+        <w:t xml:space="preserve">&lt;tec_state0&gt; </w:t>
+      </w:r>
+      <w:r>
+        <w:t>&lt;tec_temp</w:t>
+      </w:r>
+      <w:r>
+        <w:t xml:space="preserve">0&gt; &lt;tec_state1&gt; </w:t>
+      </w:r>
+      <w:r>
+        <w:t>&lt;tec_temp</w:t>
+      </w:r>
+      <w:r>
+        <w:t>1&gt; &lt;tec_state</w:t>
+      </w:r>
+      <w:r>
+        <w:t>2</w:t>
+      </w:r>
+      <w:r>
+        <w:t xml:space="preserve">&gt; </w:t>
+      </w:r>
+      <w:r>
+        <w:t>&lt;tec_temp</w:t>
+      </w:r>
+      <w:r>
+        <w:t>2</w:t>
+      </w:r>
+      <w:r>
+        <w:t>&gt; &lt;tec_state</w:t>
+      </w:r>
+      <w:r>
+        <w:t>3</w:t>
+      </w:r>
+      <w:r>
+        <w:t xml:space="preserve">&gt; </w:t>
+      </w:r>
+      <w:r>
+        <w:t>&lt;tec_temp</w:t>
+      </w:r>
+      <w:r>
+        <w:t>3</w:t>
+      </w:r>
+      <w:r>
+        <w:t xml:space="preserve">&gt; </w:t>
+      </w:r>
+      <w:r>
+        <w:t>&lt;</w:t>
+      </w:r>
+      <w:proofErr w:type="spellStart"/>
+      <w:r>
+        <w:t>hpld_curr</w:t>
+      </w:r>
+      <w:proofErr w:type="spellEnd"/>
+      <w:r>
+        <w:t>&gt;</w:t>
+      </w:r>
+      <w:r>
+        <w:t xml:space="preserve"> &lt;tec_max0&gt; &lt;tec_max1&gt; &lt;tec_max2&gt; &lt;tec_max3&gt; &lt;temp_max0&gt; &lt;temp_max1&gt;</w:t>
+      </w:r>
+      <w:r>
+        <w:t>\r"</w:t>
+      </w:r>
+    </w:p>
+    <w:p>
+      <w:pPr>
+        <w:spacing w:before="120" w:after="40"/>
+        <w:rPr>
+          <w:rFonts w:cs="Arial"/>
+        </w:rPr>
+      </w:pPr>
+      <w:r>
+        <w:rPr>
+          <w:rFonts w:cs="Arial"/>
+        </w:rPr>
+        <w:t>Response:</w:t>
+      </w:r>
+    </w:p>
+    <w:p>
+      <w:pPr>
+        <w:pStyle w:val="Responsestyle"/>
+      </w:pPr>
+      <w:r>
+        <w:t>"</w:t>
+      </w:r>
+      <w:proofErr w:type="spellStart"/>
+      <w:r>
+        <w:t>lsconf</w:t>
+      </w:r>
+      <w:proofErr w:type="spellEnd"/>
+      <w:r>
+        <w:t xml:space="preserve"> </w:t>
+      </w:r>
+      <w:proofErr w:type="spellStart"/>
+      <w:r>
+        <w:t>admn</w:t>
+      </w:r>
+      <w:proofErr w:type="spellEnd"/>
+      <w:r>
+        <w:t xml:space="preserve"> &lt;id&gt;</w:t>
+      </w:r>
+      <w:r>
+        <w:t xml:space="preserve"> &lt;</w:t>
+      </w:r>
+      <w:r>
+        <w:t xml:space="preserve">tec_state0&gt; </w:t>
+      </w:r>
+      <w:r>
+        <w:t>&lt;tec_temp</w:t>
+      </w:r>
+      <w:r>
+        <w:t xml:space="preserve">0&gt; &lt;tec_state1&gt; </w:t>
+      </w:r>
+      <w:r>
+        <w:t>&lt;tec_temp</w:t>
+      </w:r>
+      <w:r>
+        <w:t>1&gt; &lt;tec_state</w:t>
+      </w:r>
+      <w:r>
+        <w:t>2</w:t>
+      </w:r>
+      <w:r>
+        <w:t xml:space="preserve">&gt; </w:t>
+      </w:r>
+      <w:r>
+        <w:t>&lt;tec_temp</w:t>
+      </w:r>
+      <w:r>
+        <w:t>2</w:t>
+      </w:r>
+      <w:r>
+        <w:t>&gt; &lt;tec_state</w:t>
+      </w:r>
+      <w:r>
+        <w:t>3</w:t>
+      </w:r>
+      <w:r>
+        <w:t xml:space="preserve">&gt; </w:t>
+      </w:r>
+      <w:r>
+        <w:t>&lt;tec_temp</w:t>
+      </w:r>
+      <w:r>
+        <w:t>3</w:t>
+      </w:r>
+      <w:r>
+        <w:t xml:space="preserve">&gt; </w:t>
+      </w:r>
+      <w:r>
+        <w:t>&lt;</w:t>
+      </w:r>
+      <w:proofErr w:type="spellStart"/>
+      <w:r>
+        <w:t>hpld_curr</w:t>
+      </w:r>
+      <w:proofErr w:type="spellEnd"/>
+      <w:r>
+        <w:t>&gt;</w:t>
+      </w:r>
+      <w:r>
+        <w:t xml:space="preserve"> &lt;tec_max0&gt; &lt;tec_max1&gt; &lt;tec_max2&gt; &lt;tec_max3&gt; &lt;temp_max0&gt; &lt;temp_max1&gt;</w:t>
+      </w:r>
+      <w:r>
+        <w:t>\r"</w:t>
+      </w:r>
+    </w:p>
+    <w:p>
+      <w:pPr>
+        <w:spacing w:before="120" w:after="40"/>
+        <w:rPr>
+          <w:rFonts w:cs="Arial"/>
+        </w:rPr>
+      </w:pPr>
+      <w:r>
+        <w:rPr>
+          <w:rFonts w:cs="Arial"/>
+        </w:rPr>
+        <w:t>ERROR response:</w:t>
+      </w:r>
+    </w:p>
+    <w:p>
+      <w:pPr>
+        <w:pStyle w:val="Responsestyle"/>
+      </w:pPr>
+      <w:r>
+        <w:t>"</w:t>
+      </w:r>
+      <w:proofErr w:type="spellStart"/>
+      <w:r>
+        <w:t>lrconf</w:t>
+      </w:r>
+      <w:proofErr w:type="spellEnd"/>
+      <w:r>
+        <w:t xml:space="preserve"> </w:t>
+      </w:r>
+      <w:proofErr w:type="spellStart"/>
+      <w:r>
+        <w:t>admn</w:t>
+      </w:r>
+      <w:proofErr w:type="spellEnd"/>
+      <w:r>
+        <w:t xml:space="preserve"> &lt;id&gt; ERR\r"</w:t>
+      </w:r>
+    </w:p>
+    <w:p>
+      <w:r>
+        <w:t>Where:</w:t>
+      </w:r>
+    </w:p>
+    <w:p>
+      <w:pPr>
+        <w:pStyle w:val="a0"/>
+        <w:numPr>
+          <w:ilvl w:val="0"/>
+          <w:numId w:val="23"/>
+        </w:numPr>
+      </w:pPr>
+      <w:r>
+        <w:t>&lt;id&gt; - device id (int), 0 if device is single</w:t>
+      </w:r>
+    </w:p>
+    <w:p>
+      <w:pPr>
+        <w:pStyle w:val="a0"/>
+        <w:numPr>
+          <w:ilvl w:val="0"/>
+          <w:numId w:val="23"/>
+        </w:numPr>
+      </w:pPr>
+      <w:r>
+        <w:t>&lt;</w:t>
+      </w:r>
+      <w:proofErr w:type="spellStart"/>
+      <w:r>
+        <w:t>tec_</w:t>
+      </w:r>
+      <w:r>
+        <w:t>stateN</w:t>
+      </w:r>
+      <w:proofErr w:type="spellEnd"/>
+      <w:r>
+        <w:t>&gt; -</w:t>
+      </w:r>
+      <w:r>
+        <w:t xml:space="preserve"> N</w:t>
+      </w:r>
+      <w:r>
+        <w:t xml:space="preserve"> TEC </w:t>
+      </w:r>
+      <w:r>
+        <w:t>state value</w:t>
+      </w:r>
+      <w:r>
+        <w:t xml:space="preserve"> (</w:t>
+      </w:r>
+      <w:r>
+        <w:t>int</w:t>
+      </w:r>
+      <w:r>
+        <w:t xml:space="preserve">), </w:t>
+      </w:r>
+      <w:r>
+        <w:t>0 – off, 1 – on</w:t>
+      </w:r>
+    </w:p>
+    <w:p>
+      <w:pPr>
+        <w:pStyle w:val="a0"/>
+        <w:numPr>
+          <w:ilvl w:val="0"/>
+          <w:numId w:val="23"/>
+        </w:numPr>
+      </w:pPr>
+      <w:r>
+        <w:t>&lt;</w:t>
+      </w:r>
+      <w:proofErr w:type="spellStart"/>
+      <w:r>
+        <w:t>tec_temp</w:t>
+      </w:r>
+      <w:r>
+        <w:t>N</w:t>
+      </w:r>
+      <w:proofErr w:type="spellEnd"/>
+      <w:r>
+        <w:t>&gt; -</w:t>
+      </w:r>
+      <w:r>
+        <w:t xml:space="preserve"> N</w:t>
+      </w:r>
+      <w:r>
+        <w:t xml:space="preserve"> TEC temperature setpoint (float), </w:t>
+      </w:r>
+      <w:r>
+        <w:t>10.0</w:t>
+      </w:r>
+      <w:r>
+        <w:t>0</w:t>
+      </w:r>
+      <w:r>
+        <w:t xml:space="preserve"> – 200.0</w:t>
+      </w:r>
+      <w:r>
+        <w:t>0</w:t>
+      </w:r>
+      <w:r>
+        <w:t xml:space="preserve"> C</w:t>
+      </w:r>
+    </w:p>
+    <w:p>
+      <w:pPr>
+        <w:pStyle w:val="a0"/>
+        <w:numPr>
+          <w:ilvl w:val="0"/>
+          <w:numId w:val="23"/>
+        </w:numPr>
+      </w:pPr>
+      <w:r>
+        <w:t>&lt;</w:t>
+      </w:r>
+      <w:proofErr w:type="spellStart"/>
+      <w:r>
+        <w:t>hpld_curr</w:t>
+      </w:r>
+      <w:proofErr w:type="spellEnd"/>
+      <w:r>
+        <w:t xml:space="preserve">&gt; - </w:t>
+      </w:r>
+      <w:r>
+        <w:t>hpld-1000 stored current value</w:t>
+      </w:r>
+      <w:r>
+        <w:t xml:space="preserve"> (float), </w:t>
+      </w:r>
+      <w:r>
+        <w:t>0.00 – 26.00 A</w:t>
+      </w:r>
+    </w:p>
+    <w:p>
+      <w:pPr>
+        <w:pStyle w:val="a0"/>
+        <w:numPr>
+          <w:ilvl w:val="0"/>
+          <w:numId w:val="23"/>
+        </w:numPr>
+      </w:pPr>
+      <w:r>
+        <w:t>&lt;</w:t>
+      </w:r>
+      <w:proofErr w:type="spellStart"/>
+      <w:r>
+        <w:t>tec_maxN</w:t>
+      </w:r>
+      <w:proofErr w:type="spellEnd"/>
+      <w:r>
+        <w:t>&gt; - N TEC max temperature value</w:t>
+      </w:r>
+      <w:r>
+        <w:t xml:space="preserve"> (float), 0.00 – 200.00 C</w:t>
+      </w:r>
+    </w:p>
+    <w:p>
+      <w:pPr>
+        <w:pStyle w:val="a0"/>
+        <w:numPr>
+          <w:ilvl w:val="0"/>
+          <w:numId w:val="23"/>
+        </w:numPr>
+      </w:pPr>
+      <w:r>
+        <w:t>&lt;</w:t>
+      </w:r>
+      <w:proofErr w:type="spellStart"/>
+      <w:r>
         <w:t>temp_maxN</w:t>
       </w:r>
       <w:proofErr w:type="spellEnd"/>
@@ -4592,11 +5444,11 @@
       <w:pPr>
         <w:pStyle w:val="20"/>
       </w:pPr>
-      <w:bookmarkStart w:id="16" w:name="_Toc226291982"/>
+      <w:bookmarkStart w:id="22" w:name="_Toc226801195"/>
       <w:r>
         <w:t>Request get configuration</w:t>
       </w:r>
-      <w:bookmarkEnd w:id="16"/>
+      <w:bookmarkEnd w:id="22"/>
     </w:p>
     <w:p>
       <w:pPr>
@@ -4606,12 +5458,10 @@
         <w:t>"</w:t>
       </w:r>
       <w:proofErr w:type="spellStart"/>
-      <w:proofErr w:type="gramStart"/>
       <w:r>
         <w:t>lgconf</w:t>
       </w:r>
       <w:proofErr w:type="spellEnd"/>
-      <w:proofErr w:type="gramEnd"/>
       <w:r>
         <w:t xml:space="preserve"> </w:t>
       </w:r>
@@ -4747,12 +5597,10 @@
         <w:t>"</w:t>
       </w:r>
       <w:proofErr w:type="spellStart"/>
-      <w:proofErr w:type="gramStart"/>
       <w:r>
         <w:t>lrconf</w:t>
       </w:r>
       <w:proofErr w:type="spellEnd"/>
-      <w:proofErr w:type="gramEnd"/>
       <w:r>
         <w:t xml:space="preserve"> </w:t>
       </w:r>
@@ -4950,51 +5798,33 @@
       <w:pPr>
         <w:pStyle w:val="20"/>
       </w:pPr>
-      <w:bookmarkStart w:id="17" w:name="_Toc226291983"/>
+      <w:bookmarkStart w:id="23" w:name="_Toc226801196"/>
       <w:r>
         <w:t>Request save configuration</w:t>
       </w:r>
-      <w:bookmarkEnd w:id="17"/>
+      <w:bookmarkEnd w:id="23"/>
     </w:p>
     <w:p>
       <w:pPr>
         <w:pStyle w:val="Requeststyle"/>
-        <w:rPr>
-          <w:highlight w:val="yellow"/>
-        </w:rPr>
-      </w:pPr>
-      <w:r>
-        <w:rPr>
-          <w:highlight w:val="yellow"/>
-        </w:rPr>
+      </w:pPr>
+      <w:r>
         <w:t>"</w:t>
       </w:r>
       <w:proofErr w:type="spellStart"/>
       <w:r>
-        <w:rPr>
-          <w:highlight w:val="yellow"/>
-        </w:rPr>
         <w:t>lssave</w:t>
       </w:r>
       <w:proofErr w:type="spellEnd"/>
       <w:r>
-        <w:rPr>
-          <w:highlight w:val="yellow"/>
-        </w:rPr>
         <w:t xml:space="preserve"> </w:t>
       </w:r>
       <w:proofErr w:type="spellStart"/>
       <w:r>
-        <w:rPr>
-          <w:highlight w:val="yellow"/>
-        </w:rPr>
         <w:t>admn</w:t>
       </w:r>
       <w:proofErr w:type="spellEnd"/>
       <w:r>
-        <w:rPr>
-          <w:highlight w:val="yellow"/>
-        </w:rPr>
         <w:t xml:space="preserve"> &lt;id&gt;\r"</w:t>
       </w:r>
     </w:p>
@@ -5003,13 +5833,11 @@
         <w:spacing w:before="120" w:after="40"/>
         <w:rPr>
           <w:rFonts w:cs="Arial"/>
-          <w:highlight w:val="yellow"/>
         </w:rPr>
       </w:pPr>
       <w:r>
         <w:rPr>
           <w:rFonts w:cs="Arial"/>
-          <w:highlight w:val="yellow"/>
         </w:rPr>
         <w:t>Response:</w:t>
       </w:r>
@@ -5017,44 +5845,24 @@
     <w:p>
       <w:pPr>
         <w:pStyle w:val="Responsestyle"/>
-        <w:rPr>
-          <w:highlight w:val="yellow"/>
-        </w:rPr>
-      </w:pPr>
-      <w:r>
-        <w:rPr>
-          <w:highlight w:val="yellow"/>
-        </w:rPr>
+      </w:pPr>
+      <w:r>
         <w:t>"</w:t>
       </w:r>
       <w:proofErr w:type="spellStart"/>
-      <w:proofErr w:type="gramStart"/>
-      <w:r>
-        <w:rPr>
-          <w:highlight w:val="yellow"/>
-        </w:rPr>
+      <w:r>
         <w:t>lrsave</w:t>
       </w:r>
       <w:proofErr w:type="spellEnd"/>
-      <w:proofErr w:type="gramEnd"/>
-      <w:r>
-        <w:rPr>
-          <w:highlight w:val="yellow"/>
-        </w:rPr>
+      <w:r>
         <w:t xml:space="preserve"> </w:t>
       </w:r>
       <w:proofErr w:type="spellStart"/>
       <w:r>
-        <w:rPr>
-          <w:highlight w:val="yellow"/>
-        </w:rPr>
         <w:t>admn</w:t>
       </w:r>
       <w:proofErr w:type="spellEnd"/>
       <w:r>
-        <w:rPr>
-          <w:highlight w:val="yellow"/>
-        </w:rPr>
         <w:t xml:space="preserve"> &lt;id&gt; OK\r"</w:t>
       </w:r>
     </w:p>
@@ -5063,13 +5871,11 @@
         <w:spacing w:before="120" w:after="40"/>
         <w:rPr>
           <w:rFonts w:cs="Arial"/>
-          <w:highlight w:val="yellow"/>
         </w:rPr>
       </w:pPr>
       <w:r>
         <w:rPr>
           <w:rFonts w:cs="Arial"/>
-          <w:highlight w:val="yellow"/>
         </w:rPr>
         <w:t>ERROR response:</w:t>
       </w:r>
@@ -5079,39 +5885,22 @@
         <w:pStyle w:val="Responsestyle"/>
       </w:pPr>
       <w:r>
-        <w:rPr>
-          <w:highlight w:val="yellow"/>
-        </w:rPr>
         <w:t>"</w:t>
       </w:r>
       <w:proofErr w:type="spellStart"/>
-      <w:proofErr w:type="gramStart"/>
-      <w:r>
-        <w:rPr>
-          <w:highlight w:val="yellow"/>
-        </w:rPr>
+      <w:r>
         <w:t>lrsave</w:t>
       </w:r>
       <w:proofErr w:type="spellEnd"/>
-      <w:proofErr w:type="gramEnd"/>
-      <w:r>
-        <w:rPr>
-          <w:highlight w:val="yellow"/>
-        </w:rPr>
+      <w:r>
         <w:t xml:space="preserve"> </w:t>
       </w:r>
       <w:proofErr w:type="spellStart"/>
       <w:r>
-        <w:rPr>
-          <w:highlight w:val="yellow"/>
-        </w:rPr>
         <w:t>admn</w:t>
       </w:r>
       <w:proofErr w:type="spellEnd"/>
       <w:r>
-        <w:rPr>
-          <w:highlight w:val="yellow"/>
-        </w:rPr>
         <w:t xml:space="preserve"> &lt;id&gt; ERR\r"</w:t>
       </w:r>
     </w:p>
@@ -8000,6 +8789,9 @@
     <w:abstractNumId w:val="6"/>
   </w:num>
   <w:num w:numId="26">
+    <w:abstractNumId w:val="25"/>
+  </w:num>
+  <w:num w:numId="27">
     <w:abstractNumId w:val="25"/>
   </w:num>
   <w:numIdMacAtCleanup w:val="25"/>
@@ -8578,6 +9370,7 @@
   <w:style w:type="character" w:customStyle="1" w:styleId="jlqj4b">
     <w:name w:val="jlqj4b"/>
     <w:basedOn w:val="a2"/>
+    <w:qFormat/>
     <w:rsid w:val="008A686E"/>
   </w:style>
   <w:style w:type="character" w:customStyle="1" w:styleId="30">

</xml_diff>